<commit_message>
Clarify green-space adjustment and qualify clustering interpretation
</commit_message>
<xml_diff>
--- a/reports/report.docx
+++ b/reports/report.docx
@@ -5433,7 +5433,151 @@
         <w:pStyle w:val="BodyText"/>
       </w:pPr>
       <w:r>
-        <w:t xml:space="preserve">Whether green space accounts for the spatial clustering of the counts was assessed with Moran’s I</w:t>
+        <w:t xml:space="preserve">Adjustment for green space means predicting each site’s expected count from its green cover, then examining the differences between observed and predicted counts. The Pearson residual is</w:t>
+      </w:r>
+      <w:r>
+        <w:t xml:space="preserve"> </w:t>
+      </w:r>
+      <m:oMath>
+        <m:sSub>
+          <m:e>
+            <m:r>
+              <m:t>r</m:t>
+            </m:r>
+          </m:e>
+          <m:sub>
+            <m:r>
+              <m:t>i</m:t>
+            </m:r>
+          </m:sub>
+        </m:sSub>
+        <m:r>
+          <m:rPr>
+            <m:sty m:val="p"/>
+          </m:rPr>
+          <m:t>=</m:t>
+        </m:r>
+        <m:d>
+          <m:dPr>
+            <m:begChr m:val="("/>
+            <m:sepChr m:val=""/>
+            <m:endChr m:val=")"/>
+            <m:grow/>
+          </m:dPr>
+          <m:e>
+            <m:sSub>
+              <m:e>
+                <m:r>
+                  <m:t>Y</m:t>
+                </m:r>
+              </m:e>
+              <m:sub>
+                <m:r>
+                  <m:t>i</m:t>
+                </m:r>
+              </m:sub>
+            </m:sSub>
+            <m:r>
+              <m:rPr>
+                <m:sty m:val="p"/>
+              </m:rPr>
+              <m:t>−</m:t>
+            </m:r>
+            <m:sSub>
+              <m:e>
+                <m:acc>
+                  <m:accPr>
+                    <m:chr m:val="̂"/>
+                  </m:accPr>
+                  <m:e>
+                    <m:r>
+                      <m:t>μ</m:t>
+                    </m:r>
+                  </m:e>
+                </m:acc>
+              </m:e>
+              <m:sub>
+                <m:r>
+                  <m:t>i</m:t>
+                </m:r>
+              </m:sub>
+            </m:sSub>
+          </m:e>
+        </m:d>
+        <m:r>
+          <m:rPr>
+            <m:sty m:val="p"/>
+          </m:rPr>
+          <m:t>/</m:t>
+        </m:r>
+        <m:rad>
+          <m:radPr>
+            <m:degHide m:val="on"/>
+          </m:radPr>
+          <m:deg/>
+          <m:e>
+            <m:sSub>
+              <m:e>
+                <m:acc>
+                  <m:accPr>
+                    <m:chr m:val="̂"/>
+                  </m:accPr>
+                  <m:e>
+                    <m:r>
+                      <m:t>μ</m:t>
+                    </m:r>
+                  </m:e>
+                </m:acc>
+              </m:e>
+              <m:sub>
+                <m:r>
+                  <m:t>i</m:t>
+                </m:r>
+              </m:sub>
+            </m:sSub>
+          </m:e>
+        </m:rad>
+      </m:oMath>
+      <w:r>
+        <w:t xml:space="preserve">, where</w:t>
+      </w:r>
+      <w:r>
+        <w:t xml:space="preserve"> </w:t>
+      </w:r>
+      <m:oMath>
+        <m:sSub>
+          <m:e>
+            <m:acc>
+              <m:accPr>
+                <m:chr m:val="̂"/>
+              </m:accPr>
+              <m:e>
+                <m:r>
+                  <m:t>μ</m:t>
+                </m:r>
+              </m:e>
+            </m:acc>
+          </m:e>
+          <m:sub>
+            <m:r>
+              <m:t>i</m:t>
+            </m:r>
+          </m:sub>
+        </m:sSub>
+      </m:oMath>
+      <w:r>
+        <w:t xml:space="preserve"> </w:t>
+      </w:r>
+      <w:r>
+        <w:t xml:space="preserve">is the fitted expected count. A positive residual means more cases than predicted given that site’s green space; a negative residual means fewer. Residual Moran’s I asks whether neighboring sites share these unexpected excesses or deficits. Weaker residual autocorrelation is consistent with green space capturing part of the geographic pattern in the counts. The observed counts remain unchanged. This adjustment is a separate regression analysis; green space is not a covariate in the primary ordinary-kriging model.</w:t>
+      </w:r>
+    </w:p>
+    <w:p>
+      <w:pPr>
+        <w:pStyle w:val="BodyText"/>
+      </w:pPr>
+      <w:r>
+        <w:t xml:space="preserve">Spatial autocorrelation before and after this adjustment was compared using Moran’s I</w:t>
       </w:r>
       <w:r>
         <w:t xml:space="preserve"> </w:t>
@@ -11528,7 +11672,7 @@
         <w:t xml:space="preserve"> </w:t>
       </w:r>
       <w:r>
-        <w:t xml:space="preserve">A), which leaves structure in its residuals, and all of these tests have low power with 30 sites. Consistent with the Poisson result, the variogram of residuals from a linear green-space trend is flat at their variance (2.31 cases</w:t>
+        <w:t xml:space="preserve">A), which leaves structure in its residuals, and all of these tests have low power with 30 sites. The variogram comparison uses residuals from this separate linear model, rather than the Poisson model. Its residual variogram shows no clear rise with distance and lies near the residual variance (2.31 cases</w:t>
       </w:r>
       <w:r>
         <w:rPr>
@@ -11559,7 +11703,7 @@
         <w:pStyle w:val="BodyText"/>
       </w:pPr>
       <w:r>
-        <w:t xml:space="preserve">Green space therefore accounts for most of the spatial clustering described by the kriging model, but some residual dependence cannot be excluded. The course heuristic recommends considering a spatial Durbin model when both robust tests are significant</w:t>
+        <w:t xml:space="preserve">The much smaller Poisson residual Moran’s I indicates weaker positive spatial autocorrelation after accounting for green space. Green space therefore accounts for most of the spatial clustering described by the kriging model, although this is a qualitative interpretation rather than a quantified proportion of clustering explained. The comparison does not establish a causal effect. Residual dependence cannot be excluded. The course heuristic recommends considering a spatial Durbin model when both robust tests are significant</w:t>
       </w:r>
       <w:r>
         <w:t xml:space="preserve"> </w:t>
@@ -13987,7 +14131,7 @@
         <w:pStyle w:val="FirstParagraph"/>
       </w:pPr>
       <w:r>
-        <w:t xml:space="preserve">With 30 sites, spatial correlation could be estimated only under carefully chosen settings, and most automated fits failed. A spherical variogram with 3 km bins converged and improved cross-validated prediction over a no-correlation model, with standardized error SD near one. Kriging identified one high-risk zone from Marina Bay to Hougang, consistent across alternative variograms, with about twice the predicted intensity of the rest of the sampled area. Green cover is lowest in this zone and accounts for most of the spatial clustering, although without denominators the association cannot be read causally. Braddell Heights and Kampong Glam Community Clubs are accessible, well-placed venues for temporary intervention centers. Uncertainty in the variogram, the unknown support of the counts and the large unsampled area limit the operational use of the map.</w:t>
+        <w:t xml:space="preserve">With 30 sites, spatial correlation could be estimated only under carefully chosen settings, and most automated fits failed. A spherical variogram with 3 km bins converged and improved cross-validated prediction over a no-correlation model, with standardized error SD near one. Kriging identified one high-risk zone from Marina Bay to Hougang, consistent across alternative variograms, with about twice the predicted intensity of the rest of the sampled area. Green cover is lowest in this zone, and positive spatial autocorrelation was weaker after accounting for green space, consistent with green space capturing part of the geographic pattern. The ecological association cannot be read causally. Braddell Heights and Kampong Glam Community Clubs are accessible, well-placed venues for temporary intervention centers. Uncertainty in the variogram, the unknown support of the counts and the large unsampled area limit the operational use of the map.</w:t>
       </w:r>
     </w:p>
     <w:bookmarkEnd w:id="122"/>

</xml_diff>

<commit_message>
Audit manuscript claims and qualify numerical interpretations
</commit_message>
<xml_diff>
--- a/reports/report.docx
+++ b/reports/report.docx
@@ -48,7 +48,7 @@
         <w:pStyle w:val="FirstParagraph"/>
       </w:pPr>
       <w:r>
-        <w:t xml:space="preserve">Thirty sites in central Singapore reported disease case counts (0 to 6; 56 in total) and the percentage of surrounding green cover. Of 180 variogram settings searched, 5 gave stable fits. With 3 km lag bins (the narrowest with at least 30 pairs per bin) and a 10 km cutoff, a spherical model (nugget 1.47, partial sill 1.09 cases</w:t>
+        <w:t xml:space="preserve">Thirty sites in central Singapore reported disease case counts (0 to 6; 56 in total) and the percentage of surrounding green cover. Of 180 variogram settings searched, 5 met the specified stability criteria. With 3 km lag bins (the narrowest tested width with at least 30 pairs per bin) and a 10 km cutoff, a spherical model (nugget 1.47, partial sill 1.09 cases</w:t>
       </w:r>
       <w:r>
         <w:rPr>
@@ -57,7 +57,7 @@
         <w:t xml:space="preserve">2</w:t>
       </w:r>
       <w:r>
-        <w:t xml:space="preserve">, range 7.1 km) reduced leave-one-out RMSE from 1.75 (pure nugget) to 1.40 cases, with a z-score SD near one (0.97).</w:t>
+        <w:t xml:space="preserve">, range 7.1 km) gave a lower leave-one-out RMSE, from 1.75 (pure nugget) to 1.40 cases, with a z-score SD near one (0.97). The variogram was held fixed during validation, and the same errors were used for model selection, so this comparison may be optimistic.</w:t>
       </w:r>
     </w:p>
     <w:p>
@@ -125,7 +125,7 @@
         <w:t xml:space="preserve"> </w:t>
       </w:r>
       <w:r>
-        <w:t xml:space="preserve">catchment (sampled land per site). Each 10 percentage points of green cover was associated with 27% fewer expected cases (count ratio 0.73, 95% CI 0.59 to 0.89), and positive residual spatial autocorrelation was not detected after adjustment for green space. Braddell Heights and Kampong Glam Community Clubs, both inside the zone and within 300 m of an MRT exit, are proposed as intervention centers; the choice did not change under alternative variogram models. Most of the island is unsampled, and without population denominators the results describe counts, not risk per person.</w:t>
+        <w:t xml:space="preserve">catchment (sampled land per site). Each 10 percentage points of green cover was associated with 27% fewer expected cases (count ratio 0.73, 95% CI 0.59 to 0.89), and positive residual spatial autocorrelation was not detected after adjustment for green space. Braddell Heights and Kampong Glam Community Clubs, both inside the zone and within 300 m straight-line distance of an MRT exit, are proposed as intervention centers; the choice did not change under alternative variogram models. Most of the island is unsampled, and without population denominators the results describe counts, not risk per person.</w:t>
       </w:r>
     </w:p>
     <w:bookmarkEnd w:id="20"/>
@@ -152,7 +152,7 @@
         <w:t xml:space="preserve">(Matheron 1963; Cressie 1993)</w:t>
       </w:r>
       <w:r>
-        <w:t xml:space="preserve">. This report applies it to counts of an unnamed illness recorded at 30 sites in Singapore, together with the percentage of green cover around each site. The aims were (i) to estimate and justify a model of the spatial dependence of the counts; (ii) to map a continuous risk surface on a 1 km grid and delineate high-risk zones; (iii) to assess whether green cover is associated with the counts and accounts for their spatial pattern; and (iv) to quantify outbreak size in the high-risk zones and propose two accessible temporary intervention centers.</w:t>
+        <w:t xml:space="preserve">. This report applies it to counts of an unnamed illness recorded at 30 sites in Singapore, together with the percentage of green cover around each site. The aims were (i) to estimate and justify a model of the spatial dependence of the counts; (ii) to map predicted counts on a 1 km grid and delineate high-risk zones; (iii) to assess whether green cover is associated with the counts and whether residual spatial autocorrelation remains after adjustment; and (iv) to quantify outbreak size in the high-risk zones and propose two accessible temporary intervention centers.</w:t>
       </w:r>
       <w:r>
         <w:t xml:space="preserve"> </w:t>
@@ -532,7 +532,7 @@
         <w:t xml:space="preserve">(Land Transport Authority 2026)</w:t>
       </w:r>
       <w:r>
-        <w:t xml:space="preserve">. The prediction grid consisted of 1 km × 1 km squares aligned to whole kilometers of the SVY21 grid and clipped to the land outline. Each square was represented by its center, or by a point inside its land portion where the center fell in the sea, and its land area was kept for area-based calculations. Squares overlapping the convex hull of the sites (the smallest convex polygon that contains them) formed the sampled area; predictions outside it are extrapolations.</w:t>
+        <w:t xml:space="preserve">. The prediction grid consisted of 1 km × 1 km squares aligned to whole kilometers of the SVY21 grid and clipped to the land outline. Each square was represented by its center, or by a point inside its land portion where the center fell in the sea, and its land area was kept for area-based calculations. Squares overlapping the convex hull of the sites (the smallest convex polygon that contains them) defined the domain used for zone analysis, termed the sampled area below. This includes entire land portions of boundary squares, whose prediction points can fall outside the hull. Hull membership is a geometric convention and does not establish predictive reliability.</w:t>
       </w:r>
     </w:p>
     <w:bookmarkEnd w:id="22"/>
@@ -1212,16 +1212,16 @@
         </m:sSub>
       </m:oMath>
       <w:r>
-        <w:t xml:space="preserve">) is the spatially structured part of that variance. The range is the lag at which the sill is reached, beyond which counts are uncorrelated; for models that approach the sill asymptotically, the practical range is the lag at which about 95% of the partial sill is reached. The nugget-to-sill ratio summarizes the strength of spatial dependence, conventionally classed as strong below 0.25, moderate from 0.25 to 0.75 and weak above 0.75</w:t>
-      </w:r>
-      <w:r>
-        <w:t xml:space="preserve"> </w:t>
-      </w:r>
-      <w:r>
-        <w:t xml:space="preserve">(Cambardella et al. 1994)</w:t>
-      </w:r>
-      <w:r>
-        <w:t xml:space="preserve">.</w:t>
+        <w:t xml:space="preserve">) is the spatially structured part of that variance. The range is the lag at which the sill is reached, beyond which the modeled covariance is zero; for models that approach the sill asymptotically, the practical range is the lag at which about 95% of the partial sill is reached. The nugget-to-sill ratio was described using the soil-variability classification of</w:t>
+      </w:r>
+      <w:r>
+        <w:t xml:space="preserve"> </w:t>
+      </w:r>
+      <w:r>
+        <w:t xml:space="preserve">Cambardella et al. (1994)</w:t>
+      </w:r>
+      <w:r>
+        <w:t xml:space="preserve">: strong below 0.25, moderate from 0.25 to 0.75 and weak above 0.75. This is a descriptive convention, not a test of predictive reliability.</w:t>
       </w:r>
     </w:p>
     <w:tbl>
@@ -2660,7 +2660,7 @@
         </m:sSubSup>
       </m:oMath>
       <w:r>
-        <w:t xml:space="preserve">, which emphasizes short lags, where the kriging weights are largest (method 7, the gstat default)</w:t>
+        <w:t xml:space="preserve">, which emphasizes short lags in fitting the variogram (method 7, the gstat default)</w:t>
       </w:r>
       <w:r>
         <w:t xml:space="preserve"> </w:t>
@@ -2692,7 +2692,7 @@
         <w:t xml:space="preserve">2</w:t>
       </w:r>
       <w:r>
-        <w:t xml:space="preserve">, practical range 6 km) and three deliberately poor ones (practical range 0.6 km, practical range 60 km, and a nugget close to the full sill). A setting was classed as stable if (i) the sensible start converged without a warning or a singular fit; (ii) at least two starts converged and agreed within 1%; (iii) the parameters were plausible, with a positive partial sill, a practical range no longer than the cutoff (beyond which no bin carries information) and a sill at most twice the sample variance; and (iv) there were more bins than parameters.</w:t>
+        <w:t xml:space="preserve">, practical range 6 km) and three deliberately poor ones (practical range 0.6 km, practical range 60 km, and a nugget close to the full sill). A setting was classed as stable if (i) the sensible start converged without a warning or a singular fit; (ii) at least two starts converged and agreed within 1%; (iii) the parameters were plausible, with a positive partial sill, a practical range no longer than the cutoff (an analyst constraint against extrapolating the range beyond the fitted lags) and a sill at most twice the sample variance; and (iv) there were more bins than parameters.</w:t>
       </w:r>
     </w:p>
     <w:bookmarkEnd w:id="30"/>
@@ -3210,7 +3210,7 @@
         <w:t xml:space="preserve"> </w:t>
       </w:r>
       <w:r>
-        <w:t xml:space="preserve">test whether the kriging variance describes the actual errors. If it does, they have a mean near 0 and a standard deviation near 1; an SD above 1 indicates that the uncertainty is understated, and below 1 that it is overstated</w:t>
+        <w:t xml:space="preserve">provide a diagnostic comparison of prediction errors and modeled uncertainty. A mean near 0 and an SD near 1 are broadly consistent with calibration; an SD above or below 1 suggests uncertainty may be understated or overstated, respectively. With 30 dependent validation errors and a variogram fitted to all sites, these summaries do not establish calibrated intervals</w:t>
       </w:r>
       <w:r>
         <w:t xml:space="preserve"> </w:t>
@@ -3219,7 +3219,7 @@
         <w:t xml:space="preserve">(Oliver and Webster 2014)</w:t>
       </w:r>
       <w:r>
-        <w:t xml:space="preserve">. The comparator was a pure-nugget model, which assumes no spatial correlation and therefore predicts every site by the mean of the others; a spatial model is worthwhile only if it predicts better than this control</w:t>
+        <w:t xml:space="preserve">. The comparator was a pure-nugget model, which assumes no spatial correlation and therefore predicts every site by the mean of the others; lower error than this control was required by the selection rule</w:t>
       </w:r>
       <w:r>
         <w:t xml:space="preserve"> </w:t>
@@ -3228,7 +3228,7 @@
         <w:t xml:space="preserve">(Dickens 2026b)</w:t>
       </w:r>
       <w:r>
-        <w:t xml:space="preserve">. The selection rule, fixed before any mapping, was the lowest RMSE among stable fits whose bins all hold at least 30 pairs, provided the z-score SD lay between 0.8 and 1.2 and the RMSE was below that of the control. Moran’s I (</w:t>
+        <w:t xml:space="preserve">. The selection rule, fixed before any mapping, was the lowest RMSE among stable fits whose bins all hold at least 30 pairs, provided the z-score SD was greater than 0.8 and less than 1.2 and the RMSE was below that of the control. Moran’s I (</w:t>
       </w:r>
       <w:hyperlink w:anchor="sec-m-green">
         <w:r>
@@ -3383,7 +3383,7 @@
         </m:d>
       </m:oMath>
       <w:r>
-        <w:t xml:space="preserve">, with weights chosen to minimize the expected squared prediction error (the kriging variance) subject to unbiasedness; it is therefore the best linear unbiased predictor given the variogram</w:t>
+        <w:t xml:space="preserve">, with weights chosen to minimize the expected squared prediction error (the kriging variance) subject to unbiasedness; it is therefore the best linear unbiased predictor under the assumed mean and variogram</w:t>
       </w:r>
       <w:r>
         <w:t xml:space="preserve"> </w:t>
@@ -4033,7 +4033,16 @@
         <w:t xml:space="preserve"> </w:t>
       </w:r>
       <w:r>
-        <w:t xml:space="preserve">to each site and on the distances among the sites. Nearby sites generally receive more weight, and clustered sites share weight because they carry overlapping information, which distinguishes kriging from inverse distance weighting. The kriging variance depends only on the variogram and the layout of the sites, not on the observed counts, and generally increases with distance from the sites. Weights can be negative and need not decrease strictly with distance. With a nugget, the prediction at a sampled site equals the observation, but the variance at any unsampled location is at least the nugget.</w:t>
+        <w:t xml:space="preserve">to each site and on the distances among the sites. Nearby sites generally receive more weight, and clustered sites share weight because they carry overlapping information, which distinguishes kriging from inverse distance weighting. For a fixed variogram, the kriging variance depends on the observation and prediction locations rather than directly on the observed counts. The fitted variogram itself depends on those counts. The variance generally increases away from the sites but excludes uncertainty from estimating the variogram parameters</w:t>
+      </w:r>
+      <w:r>
+        <w:t xml:space="preserve"> </w:t>
+      </w:r>
+      <w:r>
+        <w:t xml:space="preserve">(Zimmerman and Cressie 1992)</w:t>
+      </w:r>
+      <w:r>
+        <w:t xml:space="preserve">. Weights can be negative and need not decrease strictly with distance. With a nugget, the prediction at a sampled site equals the observation, but the variance at any unsampled location is at least the nugget.</w:t>
       </w:r>
     </w:p>
     <w:p>
@@ -4434,7 +4443,7 @@
               <w:pStyle w:val="ImageCaption"/>
             </w:pPr>
             <w:r>
-              <w:t xml:space="preserve">Table 3: Kriging variants</w:t>
+              <w:t xml:space="preserve">Table 3: Kriging variants for the cases-per-site field. Block kriging changes the prediction support rather than specifying a separate mean model</w:t>
             </w:r>
             <w:r>
               <w:t xml:space="preserve"> </w:t>
@@ -4455,9 +4464,9 @@
             </w:tblPr>
             <w:tblGrid>
               <w:gridCol w:w="1425"/>
-              <w:gridCol w:w="2534"/>
-              <w:gridCol w:w="2059"/>
+              <w:gridCol w:w="2772"/>
               <w:gridCol w:w="1900"/>
+              <w:gridCol w:w="1821"/>
             </w:tblGrid>
             <w:tr>
               <w:trPr>
@@ -4485,7 +4494,7 @@
                     <w:jc w:val="center"/>
                   </w:pPr>
                   <w:r>
-                    <w:t xml:space="preserve">Mean of the process</w:t>
+                    <w:t xml:space="preserve">Baseline expected cases per site</w:t>
                   </w:r>
                 </w:p>
               </w:tc>
@@ -4498,7 +4507,7 @@
                     <w:jc w:val="center"/>
                   </w:pPr>
                   <w:r>
-                    <w:t xml:space="preserve">Constraint on the weights</w:t>
+                    <w:t xml:space="preserve">Unknown mean parameters</w:t>
                   </w:r>
                 </w:p>
               </w:tc>
@@ -4539,7 +4548,7 @@
                     <w:jc w:val="center"/>
                   </w:pPr>
                   <w:r>
-                    <w:t xml:space="preserve">Constant and known</w:t>
+                    <w:t xml:space="preserve">A value supplied and treated as known</w:t>
                   </w:r>
                 </w:p>
               </w:tc>
@@ -4552,7 +4561,7 @@
                     <w:jc w:val="center"/>
                   </w:pPr>
                   <w:r>
-                    <w:t xml:space="preserve">None; remaining weight on the known mean</w:t>
+                    <w:t xml:space="preserve">None for the supplied mean</w:t>
                   </w:r>
                 </w:p>
               </w:tc>
@@ -4593,7 +4602,7 @@
                     <w:jc w:val="center"/>
                   </w:pPr>
                   <w:r>
-                    <w:t xml:space="preserve">Constant but unknown</w:t>
+                    <w:t xml:space="preserve">One constant baseline across locations</w:t>
                   </w:r>
                 </w:p>
               </w:tc>
@@ -4606,7 +4615,18 @@
                     <w:jc w:val="center"/>
                   </w:pPr>
                   <w:r>
-                    <w:t xml:space="preserve">Sum to one</w:t>
+                    <w:t xml:space="preserve">The constant</w:t>
+                  </w:r>
+                  <w:r>
+                    <w:t xml:space="preserve"> </w:t>
+                  </w:r>
+                  <m:oMath>
+                    <m:r>
+                      <m:t>μ</m:t>
+                    </m:r>
+                  </m:oMath>
+                  <w:r>
+                    <w:t xml:space="preserve">, an intercept</w:t>
                   </w:r>
                 </w:p>
               </w:tc>
@@ -4647,7 +4667,7 @@
                     <w:jc w:val="center"/>
                   </w:pPr>
                   <w:r>
-                    <w:t xml:space="preserve">Trend in coordinates or covariates, known at every prediction location</w:t>
+                    <w:t xml:space="preserve">A baseline that varies with a specified trend</w:t>
                   </w:r>
                 </w:p>
               </w:tc>
@@ -4660,7 +4680,7 @@
                     <w:jc w:val="center"/>
                   </w:pPr>
                   <w:r>
-                    <w:t xml:space="preserve">Reproduce the trend</w:t>
+                    <w:t xml:space="preserve">Intercept and trend coefficients</w:t>
                   </w:r>
                 </w:p>
               </w:tc>
@@ -4728,7 +4748,7 @@
                     <w:jc w:val="center"/>
                   </w:pPr>
                   <w:r>
-                    <w:t xml:space="preserve">As ordinary kriging</w:t>
+                    <w:t xml:space="preserve">Uses the chosen ordinary or universal mean structure; predicts an area average of the cases-per-site field</w:t>
                   </w:r>
                 </w:p>
               </w:tc>
@@ -4741,7 +4761,7 @@
                     <w:jc w:val="center"/>
                   </w:pPr>
                   <w:r>
-                    <w:t xml:space="preserve">Sum to one; predicts the mean over an area</w:t>
+                    <w:t xml:space="preserve">Same mean parameters as the corresponding point model</w:t>
                   </w:r>
                 </w:p>
               </w:tc>
@@ -4770,7 +4790,243 @@
         <w:pStyle w:val="BodyText"/>
       </w:pPr>
       <w:r>
-        <w:t xml:space="preserve">The variants differ in their assumptions about the mean of the process (</w:t>
+        <w:t xml:space="preserve">Here, the mean is the baseline expected number of cases recorded per site, assuming a common observation protocol and period. It is denoted</w:t>
+      </w:r>
+      <w:r>
+        <w:t xml:space="preserve"> </w:t>
+      </w:r>
+      <m:oMath>
+        <m:r>
+          <m:t>μ</m:t>
+        </m:r>
+      </m:oMath>
+      <w:r>
+        <w:t xml:space="preserve"> </w:t>
+      </w:r>
+      <w:r>
+        <w:t xml:space="preserve">when constant, or</w:t>
+      </w:r>
+      <w:r>
+        <w:t xml:space="preserve"> </w:t>
+      </w:r>
+      <m:oMath>
+        <m:r>
+          <m:t>m</m:t>
+        </m:r>
+        <m:d>
+          <m:dPr>
+            <m:begChr m:val="("/>
+            <m:sepChr m:val=""/>
+            <m:endChr m:val=")"/>
+            <m:grow/>
+          </m:dPr>
+          <m:e>
+            <m:r>
+              <m:t>s</m:t>
+            </m:r>
+          </m:e>
+        </m:d>
+      </m:oMath>
+      <w:r>
+        <w:t xml:space="preserve"> </w:t>
+      </w:r>
+      <w:r>
+        <w:t xml:space="preserve">when it varies with location. A mean of 2 cases per site allows individual counts of 0, 3 or 6; an expected count need not be an integer. This mean is separate from the nugget, partial sill and range, which describe variation and spatial dependence.</w:t>
+      </w:r>
+    </w:p>
+    <w:p>
+      <w:pPr>
+        <w:pStyle w:val="BodyText"/>
+      </w:pPr>
+      <w:r>
+        <w:t xml:space="preserve">Simple kriging supplies the expected count beforehand and treats it as known. Ordinary kriging assumes one constant baseline but does not supply its value. Its unknown mean parameter is the intercept</w:t>
+      </w:r>
+      <w:r>
+        <w:t xml:space="preserve"> </w:t>
+      </w:r>
+      <m:oMath>
+        <m:r>
+          <m:t>μ</m:t>
+        </m:r>
+      </m:oMath>
+      <w:r>
+        <w:t xml:space="preserve">; in</w:t>
+      </w:r>
+      <w:r>
+        <w:t xml:space="preserve"> </w:t>
+      </w:r>
+      <w:r>
+        <w:rPr>
+          <w:rStyle w:val="VerbatimChar"/>
+        </w:rPr>
+        <w:t xml:space="preserve">cases ~ 1</w:t>
+      </w:r>
+      <w:r>
+        <w:t xml:space="preserve">, the</w:t>
+      </w:r>
+      <w:r>
+        <w:t xml:space="preserve"> </w:t>
+      </w:r>
+      <w:r>
+        <w:rPr>
+          <w:rStyle w:val="VerbatimChar"/>
+        </w:rPr>
+        <w:t xml:space="preserve">1</w:t>
+      </w:r>
+      <w:r>
+        <w:t xml:space="preserve"> </w:t>
+      </w:r>
+      <w:r>
+        <w:t xml:space="preserve">specifies an intercept-only mean structure. The observations inform its estimation, accounting for their spatial covariance, so the estimated baseline can differ from the arithmetic average of the 30 counts. Requiring the weights to sum to one makes the predictor unbiased for any value of</w:t>
+      </w:r>
+      <w:r>
+        <w:t xml:space="preserve"> </w:t>
+      </w:r>
+      <m:oMath>
+        <m:r>
+          <m:t>μ</m:t>
+        </m:r>
+      </m:oMath>
+      <w:r>
+        <w:t xml:space="preserve"> </w:t>
+      </w:r>
+      <w:r>
+        <w:t xml:space="preserve">under the constant-mean assumption</w:t>
+      </w:r>
+      <w:r>
+        <w:t xml:space="preserve"> </w:t>
+      </w:r>
+      <w:r>
+        <w:t xml:space="preserve">(Cressie 1993; Zimmerman and Cressie 1992)</w:t>
+      </w:r>
+      <w:r>
+        <w:t xml:space="preserve">.</w:t>
+      </w:r>
+    </w:p>
+    <w:p>
+      <w:pPr>
+        <w:pStyle w:val="BodyText"/>
+      </w:pPr>
+      <w:r>
+        <w:t xml:space="preserve">A constant baseline does not require constant predictions. After conditioning on the observed counts, spatial correlation allows nearby high or low counts to raise or lower the prediction at an unsampled site relative to that baseline.</w:t>
+      </w:r>
+    </w:p>
+    <w:p>
+      <w:pPr>
+        <w:pStyle w:val="BodyText"/>
+      </w:pPr>
+      <w:r>
+        <w:t xml:space="preserve">Universal kriging allows the baseline expected count to follow a specified trend, for example</w:t>
+      </w:r>
+      <w:r>
+        <w:t xml:space="preserve"> </w:t>
+      </w:r>
+      <m:oMath>
+        <m:r>
+          <m:t>m</m:t>
+        </m:r>
+        <m:d>
+          <m:dPr>
+            <m:begChr m:val="("/>
+            <m:sepChr m:val=""/>
+            <m:endChr m:val=")"/>
+            <m:grow/>
+          </m:dPr>
+          <m:e>
+            <m:r>
+              <m:t>s</m:t>
+            </m:r>
+          </m:e>
+        </m:d>
+        <m:r>
+          <m:rPr>
+            <m:sty m:val="p"/>
+          </m:rPr>
+          <m:t>=</m:t>
+        </m:r>
+        <m:sSub>
+          <m:e>
+            <m:r>
+              <m:t>β</m:t>
+            </m:r>
+          </m:e>
+          <m:sub>
+            <m:r>
+              <m:t>0</m:t>
+            </m:r>
+          </m:sub>
+        </m:sSub>
+        <m:r>
+          <m:rPr>
+            <m:sty m:val="p"/>
+          </m:rPr>
+          <m:t>+</m:t>
+        </m:r>
+        <m:sSub>
+          <m:e>
+            <m:r>
+              <m:t>β</m:t>
+            </m:r>
+          </m:e>
+          <m:sub>
+            <m:r>
+              <m:t>x</m:t>
+            </m:r>
+          </m:sub>
+        </m:sSub>
+        <m:r>
+          <m:t>x</m:t>
+        </m:r>
+        <m:d>
+          <m:dPr>
+            <m:begChr m:val="("/>
+            <m:sepChr m:val=""/>
+            <m:endChr m:val=")"/>
+            <m:grow/>
+          </m:dPr>
+          <m:e>
+            <m:r>
+              <m:t>s</m:t>
+            </m:r>
+          </m:e>
+        </m:d>
+        <m:r>
+          <m:rPr>
+            <m:sty m:val="p"/>
+          </m:rPr>
+          <m:t>+</m:t>
+        </m:r>
+        <m:sSub>
+          <m:e>
+            <m:r>
+              <m:t>β</m:t>
+            </m:r>
+          </m:e>
+          <m:sub>
+            <m:r>
+              <m:t>y</m:t>
+            </m:r>
+          </m:sub>
+        </m:sSub>
+        <m:r>
+          <m:t>y</m:t>
+        </m:r>
+        <m:d>
+          <m:dPr>
+            <m:begChr m:val="("/>
+            <m:sepChr m:val=""/>
+            <m:endChr m:val=")"/>
+            <m:grow/>
+          </m:dPr>
+          <m:e>
+            <m:r>
+              <m:t>s</m:t>
+            </m:r>
+          </m:e>
+        </m:d>
+      </m:oMath>
+      <w:r>
+        <w:t xml:space="preserve">. The intercept and slopes are unknown parameters, while the coordinates must be available at observation and prediction locations. Kriging with external drift uses measured covariates, such as green cover, to describe that changing baseline. It requires covariate values at prediction locations, which are unavailable here for green space. The separate Poisson regression therefore does not change the primary kriging mean model (</w:t>
       </w:r>
       <w:hyperlink w:anchor="tbl-kriging-types">
         <w:r>
@@ -4781,7 +5037,7 @@
         </w:r>
       </w:hyperlink>
       <w:r>
-        <w:t xml:space="preserve">). Simple kriging assumes that the mean is known. Ordinary kriging assumes that it is constant but unknown and estimates it implicitly through the constraint that the weights sum to one. Universal kriging models the mean as a function of the coordinates or, as kriging with external drift, of a covariate, and estimates the variogram on the residuals from that trend; the trend variable must be known at every prediction location. Ordinary kriging with all 30 sites (formula</w:t>
+        <w:t xml:space="preserve">). Ordinary kriging with all 30 sites (formula</w:t>
       </w:r>
       <w:r>
         <w:t xml:space="preserve"> </w:t>
@@ -5154,7 +5410,18 @@
         <w:pStyle w:val="FirstParagraph"/>
       </w:pPr>
       <w:r>
-        <w:t xml:space="preserve">Kriging predictions refer to points. An average over a 1 km square (block support) has less variability than a point value because averaging reduces variation at short distances, including the nugget. Its prediction averages the conditional surface over the square and need not equal the prediction at its center. Block kriging was used to check zone totals. Because kriging minimizes the error at each location separately, it produces a surface smoother than the process it estimates: high values are underpredicted, low values overpredicted, and areas above a threshold understated</w:t>
+        <w:t xml:space="preserve">Kriging predictions refer to points. Block kriging instead predicts the average of the modeled cases-per-site field over an area, retaining the units of cases per site. This is not automatically the total number of cases inside that area; conversion requires a catchment assumption (</w:t>
+      </w:r>
+      <w:hyperlink w:anchor="sec-m-zones">
+        <w:r>
+          <w:rPr>
+            <w:rStyle w:val="Hyperlink"/>
+          </w:rPr>
+          <w:t xml:space="preserve">Section 2.7</w:t>
+        </w:r>
+      </w:hyperlink>
+      <w:r>
+        <w:t xml:space="preserve">). An average over a 1 km square (block support) has less variability than a point value because averaging reduces variation at short distances, including the nugget. Its prediction averages the conditional surface over the square and need not equal the prediction at its center. Block kriging was used as a sensitivity check on zone totals, using full 1 km rectangles centered on the zone prediction points; these rectangles were not clipped to irregular coastal land portions. Kriging predictions smooth variation relative to realizations of the fitted process and can suppress extreme values and threshold exceedance. This does not imply that every high value is underpredicted or that every threshold area is underestimated</w:t>
       </w:r>
       <w:r>
         <w:t xml:space="preserve"> </w:t>
@@ -5172,7 +5439,7 @@
         <w:t xml:space="preserve">(Goovaerts 1997)</w:t>
       </w:r>
       <w:r>
-        <w:t xml:space="preserve">. The algorithm visits the prediction points in random order, kriges each from the data and the previously simulated points (here the 30 nearest), draws a value from a normal distribution with the kriging mean and variance, and adds it to the conditioning data. Each simulated surface honors the observations and reproduces the variogram, so the spread across simulations represents the variability that the kriged map smooths away. Each square was simulated at a 4 × 4 lattice of land points, together with its prediction point; their mean approximates the average over the square’s land portion. The main kriged map retains point support.</w:t>
+        <w:t xml:space="preserve">. The algorithm visits the prediction points in random order, kriges each from the data and the previously simulated points (here the 30 nearest), draws a value from a normal distribution with the kriging mean and variance, and adds it to the conditioning data. These are approximate Gaussian realizations conditional on the observations and the fixed fitted variogram, using a local neighborhood. Individual realizations need not reproduce the empirical variogram exactly, and the simulations do not propagate variogram-parameter uncertainty. Each square was simulated at a 4 × 4 lattice of land points, together with its prediction point; their mean approximates the average over the square’s land portion. The main kriged map retains point support.</w:t>
       </w:r>
     </w:p>
     <w:bookmarkEnd w:id="34"/>
@@ -5190,7 +5457,7 @@
         <w:pStyle w:val="FirstParagraph"/>
       </w:pPr>
       <w:r>
-        <w:t xml:space="preserve">High-risk squares were those in the sampled area with predictions at or above the 75th percentile (top 25%) of predictions in that area, and the core those at or above the 90th percentile (top 10%). Restricting the percentiles to the sampled area prevents extrapolated values from shifting the thresholds. The data do not state the catchment of each count, that is, the area whose cases the count records. Expressing outbreak size in cases per km</w:t>
+        <w:t xml:space="preserve">Here, high risk denotes higher predicted counts under the model, not higher incidence per person. High-risk squares were those in the sampled area with predictions at or above the 75th percentile (top 25%) of predictions in that area, and the core those at or above the 90th percentile (top 10%). Restricting the percentiles to hull-overlapping squares excludes the more distant cells from setting the thresholds, although boundary squares can include prediction points outside the hull. The data do not state the catchment of each count, that is, the area whose cases the count records. Expressing outbreak size in cases per km</w:t>
       </w:r>
       <w:r>
         <w:rPr>
@@ -5256,7 +5523,7 @@
         <w:t xml:space="preserve"> </w:t>
       </w:r>
       <w:r>
-        <w:t xml:space="preserve">and all totals and densities are divided by 6.4. The true catchment is unknown and could be smaller or larger than either value. Because the assumption rescales every square by the same factor, it changes totals and densities but not the ranking of squares, the zones, relative intensities against the lower 75% of the sampled area, or the choice of centers.</w:t>
+        <w:t xml:space="preserve">and all totals and densities are divided by 6.4. These are simple rescaling scenarios, not a change-of-support model fitted to measured catchments, and they do not bound true outbreak size. The true catchment is unknown and could be smaller or larger than either value. Because the assumption rescales every square by the same factor, it changes totals and densities but not the ranking of squares, the zones, relative intensities against the lower 75% of the sampled area, or the choice of centers.</w:t>
       </w:r>
     </w:p>
     <w:bookmarkEnd w:id="35"/>
@@ -6026,7 +6293,7 @@
         <w:t xml:space="preserve">(Bivand and Wong 2018)</w:t>
       </w:r>
       <w:r>
-        <w:t xml:space="preserve">, under two row-standardized neighbor definitions: the four nearest neighbors of each site (made symmetric), and the shortest distance band that leaves no site without a neighbor. Following</w:t>
+        <w:t xml:space="preserve">, under two row-standardized neighbor definitions: the four nearest neighbors of each site (made symmetric), and a distance band set 0.1% above the largest nearest-neighbor distance to avoid isolated sites. Following</w:t>
       </w:r>
       <w:r>
         <w:t xml:space="preserve"> </w:t>
@@ -6910,7 +7177,7 @@
         <w:pStyle w:val="FirstParagraph"/>
       </w:pPr>
       <w:r>
-        <w:t xml:space="preserve">EPSG:3414 is a transverse Mercator projection designed for Singapore, so Euclidean distances in meters are accurate over the 22 km study extent; lags, ranges and buffers are reported in kilometers. Each count is assumed to be the number of cases recorded around a site over a common but unstated period. No population or time denominator is available, so counts are not rates. Counts are treated as point observations of a continuous risk surface, although the area each count represents (its support) is unknown; this matters when outbreak size is expressed per km</w:t>
+        <w:t xml:space="preserve">EPSG:3414 is a transverse Mercator projection designed for Singapore, so Euclidean distances in meters are accurate over the 22 km study extent; lags, ranges and buffers are reported in kilometers. Each count is assumed to be the number of cases recorded around a site over a common but unstated period. No population or time denominator is available, so counts are not rates. Counts are treated as point observations of a continuous count field, although the area each count represents (its support) is unknown; this matters when outbreak size is expressed per km</w:t>
       </w:r>
       <w:r>
         <w:rPr>
@@ -7604,7 +7871,7 @@
         <w:pStyle w:val="BodyText"/>
       </w:pPr>
       <w:r>
-        <w:t xml:space="preserve">The 30 sites form 435 pairs, and half the largest separation is 11.1 km. Only 38 pairs are closer than 3 km, so no width below 3 km meets the 30-pair rule without discarding the shortest lags, which carry the information on the nugget (</w:t>
+        <w:t xml:space="preserve">The 30 sites form 435 pairs, and half the largest separation is 11.1 km. Only 38 pairs are closer than 3 km, so no tested width below 3 km meets the 30-pair rule without discarding the shortest lags, which carry the information on the nugget (</w:t>
       </w:r>
       <w:hyperlink w:anchor="tbl-bins">
         <w:r>
@@ -7615,7 +7882,7 @@
         </w:r>
       </w:hyperlink>
       <w:r>
-        <w:t xml:space="preserve">). With 3 km bins, a 9 km cutoff leaves three bins, too few for a three-parameter model, and no fit with an 11 km cutoff was stable (</w:t>
+        <w:t xml:space="preserve">). With 3 km bins, a 9 km cutoff leaves only three bins for three parameters and fails the prespecified requirement for more bins than parameters, and no fit with an 11 km cutoff was stable (</w:t>
       </w:r>
       <w:hyperlink w:anchor="sec-fitting">
         <w:r>
@@ -7646,7 +7913,7 @@
         <w:pStyle w:val="BodyText"/>
       </w:pPr>
       <w:r>
-        <w:t xml:space="preserve">At every bin width the variogram has a substantial nugget (first bins at about 1.7 to 2.8 cases</w:t>
+        <w:t xml:space="preserve">The first-bin semivariances are about 1.7 to 2.8 cases</w:t>
       </w:r>
       <w:r>
         <w:rPr>
@@ -7655,7 +7922,10 @@
         <w:t xml:space="preserve">2</w:t>
       </w:r>
       <w:r>
-        <w:t xml:space="preserve">) and levels off between about 6 and 9 km (</w:t>
+        <w:t xml:space="preserve"> </w:t>
+      </w:r>
+      <w:r>
+        <w:t xml:space="preserve">across the tested widths, consistent with unresolved short-distance variation. Several binnings show limited further increase between about 6 and 9 km, although the apparent shape depends on bin width (</w:t>
       </w:r>
       <w:hyperlink w:anchor="fig-bins">
         <w:r>
@@ -7695,7 +7965,7 @@
         <w:t xml:space="preserve"> </w:t>
       </w:r>
       <w:r>
-        <w:t xml:space="preserve">C), as expected under a large-scale gradient from the high-count southeast to the low-count west</w:t>
+        <w:t xml:space="preserve">C), which is compatible with a large-scale gradient from the high-count southeast to the low-count west, but does not distinguish a trend from sampling variability</w:t>
       </w:r>
       <w:r>
         <w:t xml:space="preserve"> </w:t>
@@ -8383,7 +8653,7 @@
         </w:r>
       </w:hyperlink>
       <w:r>
-        <w:t xml:space="preserve">). The fit is therefore insensitive to how the starting sill is split between nugget and partial sill, but not to a starting range that is wrong by an order of magnitude.</w:t>
+        <w:t xml:space="preserve">). These two starts with different nugget/partial-sill splits gave the same fit, while the two tested extreme range starts did not converge cleanly. This limited comparison does not establish insensitivity to all starting values.</w:t>
       </w:r>
     </w:p>
     <w:tbl>
@@ -9048,7 +9318,7 @@
         <w:pStyle w:val="BodyText"/>
       </w:pPr>
       <w:r>
-        <w:t xml:space="preserve">All 5 stable fits predicted better than the control (RMSE 1.40 to 1.44 against 1.75 cases). The spherical model with 3 km bins and default weights had the lowest RMSE (1.402, 20% below the control) and the lowest mean absolute error (1.206 against 1.398), with a mean z-score of -0.013 and a z-score SD of 0.965 (</w:t>
+        <w:t xml:space="preserve">All 5 stable fits predicted better than the control (RMSE 1.40 to 1.44 against 1.75 cases). The spherical model with 3 km bins and default weights had the lowest RMSE (1.402, 20% below the control) and a mean absolute error of 1.206 against 1.398 for the control, with a mean z-score of -0.013 and a z-score SD of 0.965 (</w:t>
       </w:r>
       <w:hyperlink w:anchor="tbl-cv">
         <w:r>
@@ -9059,7 +9329,7 @@
         </w:r>
       </w:hyperlink>
       <w:r>
-        <w:t xml:space="preserve">). No positive spatial autocorrelation was detected in its cross-validation residuals (Moran’s I = -0.10, p = 0.727). The exponential and Gaussian models on the same bins were close behind (RMSE 1.406 to 1.413), so the choice of family matters little for prediction; its effect on the zones is assessed in</w:t>
+        <w:t xml:space="preserve">). The exponential model had a slightly lower MAE (1.205). No positive spatial autocorrelation was detected in its cross-validation residuals (Moran’s I = -0.10, p = 0.727). The exponential and Gaussian models on the same bins were close behind (RMSE 1.406 to 1.413), so these families gave similar errors in this fixed-variogram comparison; its effect on the zones is assessed in</w:t>
       </w:r>
       <w:r>
         <w:t xml:space="preserve"> </w:t>
@@ -9376,7 +9646,7 @@
         <w:pStyle w:val="FirstParagraph"/>
       </w:pPr>
       <w:r>
-        <w:t xml:space="preserve">The nugget (1.47 cases</w:t>
+        <w:t xml:space="preserve">The fitted nugget (1.47 cases</w:t>
       </w:r>
       <w:r>
         <w:rPr>
@@ -9385,7 +9655,7 @@
         <w:t xml:space="preserve">2</w:t>
       </w:r>
       <w:r>
-        <w:t xml:space="preserve">) combines the sampling variation of small counts with real variation over distances shorter than the site spacing. Sites 2 and 25 illustrate it: 148 m apart with near-identical green cover (73.5% and 74.0%), they reported 0 and 3 cases. The sill (2.55 cases</w:t>
+        <w:t xml:space="preserve">) may reflect count variation, measurement error and spatial variation below the observed spacing; these components cannot be separated here. Sites 2 and 25 illustrate it: 148 m apart with near-identical green cover (73.5% and 74.0%), they reported 0 and 3 cases. The sill (2.55 cases</w:t>
       </w:r>
       <w:r>
         <w:rPr>
@@ -9406,7 +9676,7 @@
         <w:t xml:space="preserve"> </w:t>
       </w:r>
       <w:r>
-        <w:t xml:space="preserve">is spatially structured; the excess of the sample variance over the sill reflects the large-scale gradient. The nugget-to-sill ratio of 0.57 indicates moderate spatial dependence by the classification of</w:t>
+        <w:t xml:space="preserve">is spatially structured; the difference between the sample variance and the fitted sill does not by itself establish a large-scale trend. The nugget-to-sill ratio of 0.57 indicates moderate spatial dependence by the classification of</w:t>
       </w:r>
       <w:r>
         <w:t xml:space="preserve"> </w:t>
@@ -9418,7 +9688,7 @@
         <w:t xml:space="preserve"> </w:t>
       </w:r>
       <w:r>
-        <w:t xml:space="preserve">(0.25 to 0.75). The range (7.1 km) is 3.7 times the median nearest-neighbor distance, so most locations in the sampled area have several sites within range, which is the condition for kriging to improve on the mean</w:t>
+        <w:t xml:space="preserve">(0.25 to 0.75). The range (7.1 km) is 3.7 times the median nearest-neighbor distance, but this ratio alone does not establish how many neighbors are informative at a prediction location or guarantee an improvement over a mean-only predictor</w:t>
       </w:r>
       <w:r>
         <w:t xml:space="preserve"> </w:t>
@@ -9427,7 +9697,7 @@
         <w:t xml:space="preserve">(Dickens 2026b)</w:t>
       </w:r>
       <w:r>
-        <w:t xml:space="preserve">. These values are plausible for the data (the range lies within the cutoff and the extent, the sill is close to the sample variance and the nugget is below the sill) but imprecise, because four bins leave one degree of freedom for three parameters.</w:t>
+        <w:t xml:space="preserve">. These values are plausible for the data (the range lies within the cutoff and the extent, the sill is close to the sample variance and the nugget is below the sill) but their precision was not estimated. Only four bin means constrain three fitted parameters, and the bin estimates share observations and are not independent.</w:t>
       </w:r>
     </w:p>
     <w:bookmarkEnd w:id="71"/>
@@ -9455,7 +9725,7 @@
         <w:pStyle w:val="FirstParagraph"/>
       </w:pPr>
       <w:r>
-        <w:t xml:space="preserve">The land outline (784.8 km</w:t>
+        <w:t xml:space="preserve">The URA 2019 administrative land proxy (784.8 km</w:t>
       </w:r>
       <w:r>
         <w:rPr>
@@ -9464,7 +9734,7 @@
         <w:t xml:space="preserve">2</w:t>
       </w:r>
       <w:r>
-        <w:t xml:space="preserve">) was covered by 1,017 grid squares. Predictions ranged from 0.60 to 3.96 cases (</w:t>
+        <w:t xml:space="preserve">), rather than a current surveyed land-area estimate, was covered by 1,017 grid squares. Predictions ranged from 0.60 to 3.96 cases (</w:t>
       </w:r>
       <w:hyperlink w:anchor="fig-kriging">
         <w:r>
@@ -9484,7 +9754,16 @@
         <w:t xml:space="preserve">2</w:t>
       </w:r>
       <w:r>
-        <w:t xml:space="preserve">. They carry no information about the north, west or east of the island and are excluded from the zones.</w:t>
+        <w:t xml:space="preserve">. They rely on extending the fitted mean and covariance into unsampled regions and are excluded from the zones. For the selected spherical model, 412 prediction points are beyond the fitted range from every site; their predictions equal the estimated constant mean (1.64 cases), with kriging SD 1.65. No leave-one-out site was farther than 4.06 km from its remaining observations, so validation does not assess these remote predictions</w:t>
+      </w:r>
+      <w:r>
+        <w:t xml:space="preserve"> </w:t>
+      </w:r>
+      <w:r>
+        <w:t xml:space="preserve">(Milà et al. 2022)</w:t>
+      </w:r>
+      <w:r>
+        <w:t xml:space="preserve">.</w:t>
       </w:r>
     </w:p>
     <w:tbl>
@@ -9559,7 +9838,7 @@
               <w:pStyle w:val="ImageCaption"/>
             </w:pPr>
             <w:r>
-              <w:t xml:space="preserve">Figure 7: Ordinary kriging. Top: predicted cases, with observed counts as circles. Bottom: kriging variance, with sites in white. Dashed polygon: convex hull of the sites (the sampled area). Squares outside it are faded because their values are extrapolations.</w:t>
+              <w:t xml:space="preserve">Figure 7: Ordinary kriging. Top: predicted cases, with observed counts as circles. Bottom: kriging variance, with sites in white. Dashed polygon: convex hull of the sites (the sampled area). Squares without hull overlap are faded because their prediction points lie outside the sampled domain.</w:t>
             </w:r>
           </w:p>
           <w:bookmarkEnd w:id="76"/>
@@ -9783,7 +10062,7 @@
                     <w:jc w:val="center"/>
                   </w:pPr>
                   <w:r>
-                    <w:t xml:space="preserve">Expectation</w:t>
+                    <w:t xml:space="preserve">Interpretation</w:t>
                   </w:r>
                 </w:p>
               </w:tc>
@@ -9824,7 +10103,7 @@
                     <w:jc w:val="center"/>
                   </w:pPr>
                   <w:r>
-                    <w:t xml:space="preserve">Within observed 0 to 6</w:t>
+                    <w:t xml:space="preserve">Compare with observed 0 to 6; not a bound</w:t>
                   </w:r>
                 </w:p>
               </w:tc>
@@ -9865,7 +10144,7 @@
                     <w:jc w:val="center"/>
                   </w:pPr>
                   <w:r>
-                    <w:t xml:space="preserve">None for counts</w:t>
+                    <w:t xml:space="preserve">Flag if present; no nonnegativity constraint</w:t>
                   </w:r>
                 </w:p>
               </w:tc>
@@ -9906,7 +10185,7 @@
                     <w:jc w:val="center"/>
                   </w:pPr>
                   <w:r>
-                    <w:t xml:space="preserve">Below observed mean 1.87</w:t>
+                    <w:t xml:space="preserve">Compare with observed mean 1.87</w:t>
                   </w:r>
                 </w:p>
               </w:tc>
@@ -9947,7 +10226,7 @@
                     <w:jc w:val="center"/>
                   </w:pPr>
                   <w:r>
-                    <w:t xml:space="preserve">Below observed SD 1.72</w:t>
+                    <w:t xml:space="preserve">Compare with observed SD 1.72</w:t>
                   </w:r>
                 </w:p>
               </w:tc>
@@ -10029,7 +10308,7 @@
                     <w:jc w:val="center"/>
                   </w:pPr>
                   <w:r>
-                    <w:t xml:space="preserve">Rises away from the data</w:t>
+                    <w:t xml:space="preserve">Assess association with distance</w:t>
                   </w:r>
                 </w:p>
               </w:tc>
@@ -10070,7 +10349,7 @@
                     <w:jc w:val="center"/>
                   </w:pPr>
                   <w:r>
-                    <w:t xml:space="preserve">Higher outside</w:t>
+                    <w:t xml:space="preserve">Compare domain averages</w:t>
                   </w:r>
                 </w:p>
               </w:tc>
@@ -10250,7 +10529,7 @@
         <w:pStyle w:val="BodyText"/>
       </w:pPr>
       <w:r>
-        <w:t xml:space="preserve">The surface met every check (</w:t>
+        <w:t xml:space="preserve">These diagnostics describe the selected fitted surface (</w:t>
       </w:r>
       <w:hyperlink w:anchor="tbl-sanity">
         <w:r>
@@ -10289,7 +10568,7 @@
         <w:t xml:space="preserve"> </w:t>
       </w:r>
       <w:r>
-        <w:t xml:space="preserve">= 0.96) and leveled off beyond about 7 km at the sill plus the variance of the estimated mean. It never fell below the nugget away from the sites, because a new count at an unsampled location is uncertain by at least the nugget; at a site itself, ordinary kriging returns the observation with zero variance. Randomly permuting the counts among the sites left the variance unchanged while changing the predictions (correlation with the original surface -0.51). The variance therefore reflects the sampling layout rather than the counts</w:t>
+        <w:t xml:space="preserve">= 0.96) and leveled off beyond about 7 km at the sill plus the variance of the estimated mean. It never fell below the nugget away from the sites, because a new count at an unsampled location is uncertain by at least the nugget; at a site itself, ordinary kriging returns the observation with zero variance. Randomly permuting the counts among the sites left the variance unchanged while changing the predictions (correlation with the original surface -0.51). This confirms that variance is independent of the count values when the fitted variogram is held fixed</w:t>
       </w:r>
       <w:r>
         <w:t xml:space="preserve"> </w:t>
@@ -10298,7 +10577,16 @@
         <w:t xml:space="preserve">(Dickens 2026b)</w:t>
       </w:r>
       <w:r>
-        <w:t xml:space="preserve">: it shows where predictions are supported, not where risk is high.</w:t>
+        <w:t xml:space="preserve">. It describes conditional model uncertainty, not disease risk or a validated boundary of reliable prediction. Variogram estimation and model misspecification remain unaccounted for</w:t>
+      </w:r>
+      <w:r>
+        <w:t xml:space="preserve"> </w:t>
+      </w:r>
+      <w:r>
+        <w:t xml:space="preserve">(Zimmerman and Cressie 1992)</w:t>
+      </w:r>
+      <w:r>
+        <w:t xml:space="preserve">.</w:t>
       </w:r>
     </w:p>
     <w:tbl>
@@ -10436,21 +10724,20 @@
               <w:pStyle w:val="ImageCaption"/>
             </w:pPr>
             <w:r>
-              <w:t xml:space="preserve">Table 9: Share of squares in the sampled area exceeding each threshold: on the kriged map, and averaged over 200 conditional simulations of 1 km² block means and of point values.</w:t>
+              <w:t xml:space="preserve">Table 9: Share of squares in the sampled area exceeding each threshold: on the kriged map, and averaged over 200 conditional simulations of land-lattice means in nominal 1 km² cells and of point values.</w:t>
             </w:r>
           </w:p>
           <w:tbl>
             <w:tblPr>
               <w:tblStyle w:val="Table"/>
-              <w:tblW w:type="pct" w:w="5000"/>
-              <w:tblLayout w:type="fixed"/>
+              <w:tblW w:type="auto" w:w="0"/>
               <w:tblLook w:firstRow="1" w:lastRow="0" w:firstColumn="0" w:lastColumn="0" w:noHBand="0" w:noVBand="0" w:val="0020"/>
             </w:tblPr>
             <w:tblGrid>
-              <w:gridCol w:w="2066"/>
-              <w:gridCol w:w="1262"/>
-              <w:gridCol w:w="2640"/>
-              <w:gridCol w:w="1951"/>
+              <w:gridCol w:w="1980"/>
+              <w:gridCol w:w="1980"/>
+              <w:gridCol w:w="1980"/>
+              <w:gridCol w:w="1980"/>
             </w:tblGrid>
             <w:tr>
               <w:trPr>
@@ -10491,7 +10778,7 @@
                     <w:jc w:val="center"/>
                   </w:pPr>
                   <w:r>
-                    <w:t xml:space="preserve">Simulated 1 km² blocks</w:t>
+                    <w:t xml:space="preserve">Simulated cell means</w:t>
                   </w:r>
                 </w:p>
               </w:tc>
@@ -10682,7 +10969,7 @@
         <w:pStyle w:val="BodyText"/>
       </w:pPr>
       <w:r>
-        <w:t xml:space="preserve">Compared with simulated averages over the squares, the point-support kriged map shows about half as many squares above 3 cases as the simulations (6.3% against 11.4%), and none above 4 cases, against 2.1% in the simulations (</w:t>
+        <w:t xml:space="preserve">The point-support kriged map has 6.3% of sampled-area squares above 3 cases and none above 4, compared with averages of 11.4% and 2.1% across simulated block means (</w:t>
       </w:r>
       <w:hyperlink w:anchor="tbl-exceed">
         <w:r>
@@ -10693,7 +10980,7 @@
         </w:r>
       </w:hyperlink>
       <w:r>
-        <w:t xml:space="preserve">). Point values exceed the thresholds more often (20.8% above 3 cases) because they retain the nugget variation that averages out within a square. The probability that a square’s mean exceeds 3 cases reaches 0.94 in the top-10% core and exceeds 0.5 in 52% of the core’s squares (</w:t>
+        <w:t xml:space="preserve">). This comparison changes both prediction type and spatial support, so it is not a direct estimate of undercounting or an isolated measure of smoothing bias. Point values exceed the thresholds more often (20.8% above 3 cases) because they retain the nugget variation that is reduced by averaging at multiple points. The simulation-based frequency of a square’s land-lattice mean exceeding 3 cases reaches 0.94 in the top-10% core and exceeds 0.5 in 52% of the core’s squares (</w:t>
       </w:r>
       <w:hyperlink w:anchor="fig-exceed">
         <w:r>
@@ -10704,7 +10991,7 @@
         </w:r>
       </w:hyperlink>
       <w:r>
-        <w:t xml:space="preserve">). Because the simulations are conditioned on the same data and centered on the kriged surface, they do not independently confirm the location of the zones; they illustrate the variability and threshold exceedance suppressed by smoothing. Treating counts as Gaussian makes these probabilities approximate.</w:t>
+        <w:t xml:space="preserve">). Because the simulations are conditioned on the same data and centered on the kriged surface, they do not independently confirm the location of the zones; they illustrate the variability and threshold exceedance suppressed by smoothing. Treating counts as Gaussian and holding the variogram fixed make these frequencies model-dependent. With 200 simulations, the nominal Monte Carlo standard error for a single frequency is at most about 0.035 if simulations are independent; this excludes parameter and model uncertainty.</w:t>
       </w:r>
     </w:p>
     <w:tbl>
@@ -11143,7 +11430,7 @@
         <w:pStyle w:val="BodyText"/>
       </w:pPr>
       <w:r>
-        <w:t xml:space="preserve">Each additional 10 percentage points of green space multiplied the expected count by 0.73 (27% fewer cases; 95% CI 0.59 to 0.89; likelihood ratio p = 0.001;</w:t>
+        <w:t xml:space="preserve">In the fitted Poisson model, each additional 10 percentage points of green space was associated with an expected-count ratio of 0.73 (27% fewer cases; 95% CI 0.59 to 0.89; likelihood ratio p = 0.001;</w:t>
       </w:r>
       <w:r>
         <w:t xml:space="preserve"> </w:t>
@@ -11174,7 +11461,7 @@
         <w:t xml:space="preserve"> </w:t>
       </w:r>
       <w:r>
-        <w:t xml:space="preserve">A). The intercept lies outside the observed range of green space and has no substantive meaning. The Pearson dispersion statistic was 1.30, and a quasi-Poisson fit widened the interval only slightly (Wald interval 0.58 to 0.92). Green space explained 19% of the null deviance. Without a denominator, the ratio compares expected counts at sites, not incidence rates.</w:t>
+        <w:t xml:space="preserve">A). The intercept corresponds to extrapolation to 0% green cover, outside the observed range, and should not be interpreted as a validated count prediction. The Pearson dispersion statistic was 1.30, and a quasi-Poisson fit widened the interval only slightly (Wald interval 0.58 to 0.92). Adding green space reduced model deviance by 19% relative to the intercept-only model; this is not a percentage of variance or spatial clustering explained. Without a denominator, the ratio compares expected counts at sites, not incidence rates. These model-based intervals do not account for any remaining spatial dependence.</w:t>
       </w:r>
     </w:p>
     <w:tbl>
@@ -11271,7 +11558,7 @@
         <w:pStyle w:val="FirstParagraph"/>
       </w:pPr>
       <w:r>
-        <w:t xml:space="preserve">The shortest distance band that leaves no site without a neighbor was 4.06 km.</w:t>
+        <w:t xml:space="preserve">The distance band used to avoid isolated sites was 4.06 km, the largest nearest-neighbor distance multiplied by 1.001.</w:t>
       </w:r>
     </w:p>
     <w:tbl>
@@ -11658,7 +11945,7 @@
         <w:t xml:space="preserve"> </w:t>
       </w:r>
       <w:r>
-        <w:t xml:space="preserve">0.28). The linear model gave a less clear result. Its residual Moran’s I was borderline (p = 0.055 and 0.158), but the robust LM tests for both error and lag dependence were significant (p = 0.007 to 0.024). A straight line misfits the convex relationship between counts and green space (</w:t>
+        <w:t xml:space="preserve">0.28). The linear model gave a less clear result. Its residual Moran’s I was borderline (p = 0.055 and 0.158), but the robust LM tests for both error and lag dependence were significant (p = 0.007 to 0.024). The linear and Poisson models use different mean and variance assumptions, so their residual diagnostics need not agree (</w:t>
       </w:r>
       <w:hyperlink w:anchor="fig-green">
         <w:r>
@@ -11672,7 +11959,7 @@
         <w:t xml:space="preserve"> </w:t>
       </w:r>
       <w:r>
-        <w:t xml:space="preserve">A), which leaves structure in its residuals, and all of these tests have low power with 30 sites. The variogram comparison uses residuals from this separate linear model, rather than the Poisson model. Its residual variogram shows no clear rise with distance and lies near the residual variance (2.31 cases</w:t>
+        <w:t xml:space="preserve">A). With only 30 sites, lack of significance cannot exclude residual dependence; no power calculation was performed. The variogram comparison uses residuals from this separate linear model, rather than the Poisson model. Its residual variogram shows no clear rise with distance and lies near the residual variance (2.31 cases</w:t>
       </w:r>
       <w:r>
         <w:rPr>
@@ -11703,7 +11990,7 @@
         <w:pStyle w:val="BodyText"/>
       </w:pPr>
       <w:r>
-        <w:t xml:space="preserve">The much smaller Poisson residual Moran’s I indicates weaker positive spatial autocorrelation after accounting for green space. Green space therefore accounts for most of the spatial clustering described by the kriging model, although this is a qualitative interpretation rather than a quantified proportion of clustering explained. The comparison does not establish a causal effect. Residual dependence cannot be excluded. The course heuristic recommends considering a spatial Durbin model when both robust tests are significant</w:t>
+        <w:t xml:space="preserve">The much smaller Poisson residual Moran’s I indicates weaker positive spatial autocorrelation after accounting for green space. This is consistent with green space capturing part of the geographic pattern in the counts; no proportion of spatial clustering explained was estimated. The comparison does not establish a causal effect. Residual dependence cannot be excluded. The course heuristic recommends considering a spatial Durbin model when both robust tests are significant</w:t>
       </w:r>
       <w:r>
         <w:t xml:space="preserve"> </w:t>
@@ -11712,7 +11999,7 @@
         <w:t xml:space="preserve">(Dickens 2026a)</w:t>
       </w:r>
       <w:r>
-        <w:t xml:space="preserve">, but these tests do not identify it uniquely; for counts at 30 sites, a spatial Poisson model is the more appropriate extension (</w:t>
+        <w:t xml:space="preserve">, but these tests do not identify it uniquely; a spatial count model with a suitable observation distribution could be assessed as an extension (</w:t>
       </w:r>
       <w:hyperlink w:anchor="sec-more-data">
         <w:r>
@@ -11886,7 +12173,7 @@
         <w:t xml:space="preserve"> </w:t>
       </w:r>
       <w:r>
-        <w:t xml:space="preserve">(23 cases). For comparison, the 10 sites inside the zone recorded 36 of the 56 cases (0.65 per km</w:t>
+        <w:t xml:space="preserve">(23 cases). For comparison, the 10 sites inside the zone recorded 36 of the 56 cases (0.65 recorded cases per km</w:t>
       </w:r>
       <w:r>
         <w:rPr>
@@ -11898,7 +12185,7 @@
         <w:t xml:space="preserve"> </w:t>
       </w:r>
       <w:r>
-        <w:t xml:space="preserve">of zone).</w:t>
+        <w:t xml:space="preserve">of zone). This is a descriptive ratio of sampled counts to zone area, not a complete estimate of the zone’s observed case density.</w:t>
       </w:r>
     </w:p>
     <w:tbl>
@@ -12475,7 +12762,7 @@
         <w:pStyle w:val="FirstParagraph"/>
       </w:pPr>
       <w:r>
-        <w:t xml:space="preserve">The 2024 club dataset flags five clubs near the zone as under construction or pending upgrading or relocation (Braddell Heights, Paya Lebar Kovan, Toa Payoh Central, Mountbatten and Bidadari), but the current official directory lists all of them as operating</w:t>
+        <w:t xml:space="preserve">The 2024 club dataset flags five clubs near the zone as under construction or pending upgrading or relocation (Braddell Heights, Paya Lebar Kovan, Toa Payoh Central, Mountbatten and Bidadari), but all five have official directory listings</w:t>
       </w:r>
       <w:r>
         <w:t xml:space="preserve"> </w:t>
@@ -12484,7 +12771,10 @@
         <w:t xml:space="preserve">(People’s Association 2026)</w:t>
       </w:r>
       <w:r>
-        <w:t xml:space="preserve">, so the flags were disregarded. After removing one superseded address and venues that are not community clubs, 116 clubs remained, of which 32 lay within 500 m of an MRT exit and within 1 km of the top-25% zone, giving 496 candidate pairs.</w:t>
+        <w:t xml:space="preserve"> </w:t>
+      </w:r>
+      <w:r>
+        <w:t xml:space="preserve">and were retained as candidates. Listings do not establish availability for an intervention, so operating status and capacity still require operator confirmation. After removing one superseded address and venues that are not community clubs, 116 clubs remained, of which 32 lay within 500 m of an MRT exit and within 1 km of the top-25% zone, giving 496 candidate pairs.</w:t>
       </w:r>
     </w:p>
     <w:tbl>
@@ -12950,7 +13240,7 @@
         <w:pStyle w:val="BodyText"/>
       </w:pPr>
       <w:r>
-        <w:t xml:space="preserve">Braddell Heights Community Club (50 Serangoon Avenue 2) lies in the northern part of the zone, 141 m from Exit F of Serangoon MRT station, an interchange of the North East and Circle lines next to Serangoon bus interchange. It is the nearer center for 23 squares holding about 49 estimated cases in the Serangoon, Hougang and Toa Payoh estates. Kampong Glam Community Club (385 Beach Road) lies inside the top-10% core, 290 m from Exit A of Nicoll Highway MRT station. It is the nearer center for 33 squares holding about 95 estimated cases, between the city center, Kampong Glam and Kallang, and is within reach of the daytime workforce around Marina Bay. The official directory, checked on 7 and 8 October 2026, lists both clubs at these addresses as wheelchair accessible</w:t>
+        <w:t xml:space="preserve">Braddell Heights Community Club (50 Serangoon Avenue 2) lies in the northern part of the zone, 141 m from Exit F of Serangoon MRT station, an interchange of the North East and Circle lines next to Serangoon bus interchange. It is the nearer center for 23 squares holding about 49 estimated cases in the Serangoon, Hougang and Toa Payoh estates. Kampong Glam Community Club (385 Beach Road) lies inside the top-10% core, 290 m from Exit A of Nicoll Highway MRT station. It is the nearer center for 33 squares holding about 95 estimated cases, between the city center, Kampong Glam and Kallang. The official directory, checked on 7 and 8 October 2026, lists both clubs at these addresses as wheelchair accessible</w:t>
       </w:r>
       <w:r>
         <w:t xml:space="preserve"> </w:t>
@@ -12978,7 +13268,7 @@
         </w:r>
       </w:hyperlink>
       <w:r>
-        <w:t xml:space="preserve">). The same pair was selected under every alternative variogram model and without site 25 (</w:t>
+        <w:t xml:space="preserve">). The same pair was selected under the tested alternative ordinary-kriging variograms and without site 25 (</w:t>
       </w:r>
       <w:hyperlink w:anchor="tbl-sensitivity">
         <w:r>
@@ -12989,7 +13279,7 @@
         </w:r>
       </w:hyperlink>
       <w:r>
-        <w:t xml:space="preserve">). The objective is flat near its minimum, however: replacing Kampong Glam with Jalan Besar CC adds 51 m to the mean distance, and replacing Braddell Heights with Paya Lebar Kovan CC adds 82 m. Either is a reasonable substitute if a proposed venue is unavailable.</w:t>
+        <w:t xml:space="preserve">). The objective is flat near its minimum, however: replacing Kampong Glam with Jalan Besar CC adds 51 m to the mean distance, and replacing Braddell Heights with Paya Lebar Kovan CC adds 82 m. These are candidates for further assessment if a proposed venue is unavailable; route access, capacity and permission were not evaluated.</w:t>
       </w:r>
     </w:p>
     <w:bookmarkEnd w:id="116"/>
@@ -13017,7 +13307,7 @@
         <w:pStyle w:val="FirstParagraph"/>
       </w:pPr>
       <w:r>
-        <w:t xml:space="preserve">Kriging derives its weights from the spatial correlation of the data rather than from an arbitrary inverse-distance power, shares weight among clustered sites (such as the four around Marina Bay) instead of counting each in full, and provides a prediction variance that separates supported predictions from extrapolations. Here it reduced cross-validated error by 20% relative to the mean-only model, with z-score SDs near one in every sensitivity scenario ( 0.95 to 1.04). The top-25% zone was largely stable across alternative variograms (Jaccard overlap 0.84 or more), and the same centers were chosen each time (</w:t>
+        <w:t xml:space="preserve">Kriging derives its weights from the spatial correlation of the data rather than from an arbitrary inverse-distance power, shares weight among clustered sites (such as the four around Marina Bay) instead of counting each in full, and provides a conditional prediction variance under the fitted model. This variance does not itself classify locations as reliable or validate extrapolation. In this fixed-variogram comparison, its RMSE was lower by 20% relative to the mean-only model, with z-score SDs near one in every sensitivity scenario ( 0.95 to 1.04). The top-25% zone was largely stable across alternative variograms (Jaccard overlap 0.84 or more), and the same centers were chosen in the five ordinary-kriging scenarios, including the selected model. The universal-kriging scenario instead chose Kampong Glam and MacPherson Community Clubs (</w:t>
       </w:r>
       <w:hyperlink w:anchor="tbl-sensitivity">
         <w:r>
@@ -13831,19 +14121,19 @@
         <w:pStyle w:val="BodyText"/>
       </w:pPr>
       <w:r>
-        <w:t xml:space="preserve">Most limitations follow from the sample size. The variogram is barely estimable: only 38 pairs are closer than 3 km, the 30-pair rule leaves four bins for three parameters, and 134 of 180 settings failed to converge. Across the stable fits the nugget ranged from 1.17 to 1.76 and the practical range from 7.1 to 9.1 km. Thirty sites is far below the 100 to 150 recommended for variogram estimation</w:t>
-      </w:r>
-      <w:r>
-        <w:t xml:space="preserve"> </w:t>
-      </w:r>
-      <w:r>
-        <w:t xml:space="preserve">(Webster and Oliver 1992)</w:t>
-      </w:r>
-      <w:r>
-        <w:t xml:space="preserve"> </w:t>
-      </w:r>
-      <w:r>
-        <w:t xml:space="preserve">and at the lower limit of 30 to 50 well-spread points below which a stable variogram is rarely obtained</w:t>
+        <w:t xml:space="preserve">Most limitations follow from the sample size. The variogram is barely estimable: only 38 pairs are closer than 3 km, the 30-pair rule leaves four bins for three parameters, and 134 of 180 settings had a warning or singular fit from the sensible start. Across the stable fits the nugget ranged from 1.17 to 1.76 and the practical range from 7.1 to 9.1 km. In soil-survey simulations,</w:t>
+      </w:r>
+      <w:r>
+        <w:t xml:space="preserve"> </w:t>
+      </w:r>
+      <w:r>
+        <w:t xml:space="preserve">Webster and Oliver (1992)</w:t>
+      </w:r>
+      <w:r>
+        <w:t xml:space="preserve"> </w:t>
+      </w:r>
+      <w:r>
+        <w:t xml:space="preserve">found that at least 100 observations were needed in the studied settings and that 150 could often be satisfactory for normally distributed isotropic variables. These are context-specific design results, not a universal minimum for these counts. The course also cautions about variogram stability below roughly 30 to 50 well-spread sites</w:t>
       </w:r>
       <w:r>
         <w:t xml:space="preserve"> </w:t>
@@ -13852,7 +14142,7 @@
         <w:t xml:space="preserve">(Dickens 2026b)</w:t>
       </w:r>
       <w:r>
-        <w:t xml:space="preserve">. Single sites are influential: site 25 reported 3 cases while the five sites within 3 km of it reported 0 or 1, and removing it nearly halved the nugget (1.47 to 0.79) and raised the maximum prediction from 3.96 to 4.70. With a nugget of 57% of the sill and a median spacing of 1.9 km, the surface cannot resolve hotspots smaller than a few kilometers, and 78% of the squares are extrapolations.</w:t>
+        <w:t xml:space="preserve">. Single sites are influential: site 25 reported 3 cases while the five sites within 3 km of it reported 0 or 1, and removing it nearly halved the nugget (1.47 to 0.79) and raised the maximum prediction from 3.96 to 4.70. With a nugget of 57% of the sill and a median spacing of 1.9 km, fine-scale hotspots are poorly informed by this sampling design; no minimum resolvable hotspot size was estimated, and 78% of the squares are extrapolations.</w:t>
       </w:r>
     </w:p>
     <w:p>
@@ -13860,7 +14150,19 @@
         <w:pStyle w:val="BodyText"/>
       </w:pPr>
       <w:r>
-        <w:t xml:space="preserve">The model is also misspecified for counts. Ordinary kriging is a linear predictor that ignores the discreteness of counts and the dependence of their variance on the mean, and Gaussian assumptions enter its intervals and the simulations. Without denominators it cannot separate risk from the number of people present, and the unknown support of the counts changes outbreak densities about six-fold</w:t>
+        <w:t xml:space="preserve">Ordinary kriging does not explicitly model the discreteness of counts or a count-specific mean-variance relationship. Its linear-prediction equations do not require Gaussian observations, but Gaussian assumptions enter the intervals and simulations used here. Without denominators it cannot separate risk from the number of people present. Conversion to cases per km</w:t>
+      </w:r>
+      <w:r>
+        <w:rPr>
+          <w:vertAlign w:val="superscript"/>
+        </w:rPr>
+        <w:t xml:space="preserve">2</w:t>
+      </w:r>
+      <w:r>
+        <w:t xml:space="preserve"> </w:t>
+      </w:r>
+      <w:r>
+        <w:t xml:space="preserve">also requires an unverified assumption about the area represented by each count</w:t>
       </w:r>
       <w:r>
         <w:t xml:space="preserve"> </w:t>
@@ -13869,7 +14171,7 @@
         <w:t xml:space="preserve">(Gotway and Young 2002)</w:t>
       </w:r>
       <w:r>
-        <w:t xml:space="preserve">. The constant-mean assumption is doubtful given the large-scale gradient, but universal kriging with a linear trend in the coordinates performed worse: its residual variogram could only be fitted as a pure nugget, its RMSE was higher (1.54), and it predicted negative values (minimum -2.00) in extrapolated areas. Green space explains much of the gradient but cannot serve as a trend variable, because it is known only at the sites</w:t>
+        <w:t xml:space="preserve">. The constant-mean assumption is doubtful given the large-scale gradient, but universal kriging with a linear trend in the coordinates performed worse: the attempted spherical residual fit did not converge cleanly, so the implementation used a pure-nugget fallback, its RMSE was higher (1.54), and it predicted negative values (minimum -2.00) in extrapolated areas. Green space is associated with the counts, but using it as an external-drift variable would require values at prediction locations; it is supplied only at the sites</w:t>
       </w:r>
       <w:r>
         <w:t xml:space="preserve"> </w:t>
@@ -13878,7 +14180,7 @@
         <w:t xml:space="preserve">(Dickens 2026b)</w:t>
       </w:r>
       <w:r>
-        <w:t xml:space="preserve">. Isotropy cannot be tested with so few pairs per direction, and if sites were chosen because of high counts, preferential sampling would bias both the mean and the variogram</w:t>
+        <w:t xml:space="preserve">. Directional variograms were not assessed, so isotropy remains an assumption. If site selection depended on case counts, ignoring that sampling process could bias spatial inference</w:t>
       </w:r>
       <w:r>
         <w:t xml:space="preserve"> </w:t>
@@ -13905,23 +14207,7 @@
         <w:pStyle w:val="FirstParagraph"/>
       </w:pPr>
       <w:r>
-        <w:t xml:space="preserve">The illness is not named, and green space could act in either direction depending on how it is transmitted. The observed negative association is consistent with green space as a barrier. Greener areas have fewer residents, workers and buildings, so contact rates for person-to-person transmission are lower. For dengue, transmission in Singapore is urban:</w:t>
-      </w:r>
-      <w:r>
-        <w:t xml:space="preserve"> </w:t>
-      </w:r>
-      <w:r>
-        <w:rPr>
-          <w:i/>
-          <w:iCs/>
-        </w:rPr>
-        <w:t xml:space="preserve">Aedes aegypti</w:t>
-      </w:r>
-      <w:r>
-        <w:t xml:space="preserve"> </w:t>
-      </w:r>
-      <w:r>
-        <w:t xml:space="preserve">breeds mainly in domestic containers</w:t>
+        <w:t xml:space="preserve">The illness is not named, and green space could act in either direction depending on how it is transmitted. The negative association does not identify a protective effect of vegetation. Differences in resident and daytime population or urban form could instead produce fewer recorded cases at greener sites; these quantities and contact rates were not measured. Singapore dengue studies have documented domestic-container breeding</w:t>
       </w:r>
       <w:r>
         <w:t xml:space="preserve"> </w:t>
@@ -13933,7 +14219,7 @@
         <w:t xml:space="preserve"> </w:t>
       </w:r>
       <w:r>
-        <w:t xml:space="preserve">and in outdoor drains, and incidence is highest in low-rise housing, where drainage networks are densest</w:t>
+        <w:t xml:space="preserve">and greater incidence in low-rise housing associated with denser drainage networks in the studied setting</w:t>
       </w:r>
       <w:r>
         <w:t xml:space="preserve"> </w:t>
@@ -13942,7 +14228,7 @@
         <w:t xml:space="preserve">(Seidahmed et al. 2018)</w:t>
       </w:r>
       <w:r>
-        <w:t xml:space="preserve">. Green space is also associated with better general health and lower physiological stress</w:t>
+        <w:t xml:space="preserve">. These examples concern dengue and cannot identify the unnamed illness or its transmission mechanism here. Reported associations between green-space exposure, general health and stress markers</w:t>
       </w:r>
       <w:r>
         <w:t xml:space="preserve"> </w:t>
@@ -13951,7 +14237,10 @@
         <w:t xml:space="preserve">(Twohig-Bennett and Jones 2018)</w:t>
       </w:r>
       <w:r>
-        <w:t xml:space="preserve">, which could reduce susceptibility or severity.</w:t>
+        <w:t xml:space="preserve"> </w:t>
+      </w:r>
+      <w:r>
+        <w:t xml:space="preserve">do not establish reduced susceptibility to this illness.</w:t>
       </w:r>
     </w:p>
     <w:p>
@@ -13981,7 +14270,7 @@
         <w:t xml:space="preserve">(Paupy et al. 2009)</w:t>
       </w:r>
       <w:r>
-        <w:t xml:space="preserve">, and leptospirosis is sustained by rodent reservoirs, contaminated soil and water, and recreational exposure</w:t>
+        <w:t xml:space="preserve">, and leptospirosis can involve rodent reservoirs and exposure to contaminated soil or water, including during outdoor recreation</w:t>
       </w:r>
       <w:r>
         <w:t xml:space="preserve"> </w:t>
@@ -13990,7 +14279,7 @@
         <w:t xml:space="preserve">(Bharti et al. 2003)</w:t>
       </w:r>
       <w:r>
-        <w:t xml:space="preserve">. These mechanisms could produce a positive association. The negative ecological association here cannot identify the transmission mechanism; population density could conceal a positive effect of vegetation.</w:t>
+        <w:t xml:space="preserve">. These are plausible disease-specific pathways, not evidence that vegetation increased transmission in this dataset. The negative ecological association here cannot identify the transmission mechanism; population density could conceal a positive effect of vegetation.</w:t>
       </w:r>
     </w:p>
     <w:p>
@@ -13998,7 +14287,7 @@
         <w:pStyle w:val="BodyText"/>
       </w:pPr>
       <w:r>
-        <w:t xml:space="preserve">A more parsimonious explanation is confounding by urban form. The least green sites are in the city center and dense estates and the greenest in nature reserves and the western green belt, so without denominators the count ratio of 0.73 cannot distinguish lower risk per person from fewer people at risk. The lack of detected positive residual autocorrelation is consistent with green space capturing part of the spatial gradient, but does not establish causality. Factors with a similar gradient, such as housing type or daytime population, could also explain the pattern. The association is ecological and cross-sectional and cannot be transferred to individuals</w:t>
+        <w:t xml:space="preserve">Confounding by urban form is another plausible explanation; competing mechanisms were not compared. The least green sites are in the city center and dense estates and the greenest in nature reserves and the western green belt, so without denominators the count ratio of 0.73 cannot distinguish lower risk per person from fewer people at risk. The lack of detected positive residual autocorrelation is consistent with green space capturing part of the spatial gradient, but does not establish causality. Factors with a similar gradient, such as housing type or daytime population, could also explain the pattern. The association is ecological and cross-sectional and cannot be transferred to individuals</w:t>
       </w:r>
       <w:r>
         <w:t xml:space="preserve"> </w:t>
@@ -14046,7 +14335,7 @@
         <w:t xml:space="preserve">(Diggle et al. 1998)</w:t>
       </w:r>
       <w:r>
-        <w:t xml:space="preserve">. Information on the area or population each count represents would also fix the conversion to cases per km</w:t>
+        <w:t xml:space="preserve">. Information on the area represented by each count is also needed to justify conversion to cases per km</w:t>
       </w:r>
       <w:r>
         <w:rPr>
@@ -14055,16 +14344,19 @@
         <w:t xml:space="preserve">2</w:t>
       </w:r>
       <w:r>
-        <w:t xml:space="preserve">, which currently varies six-fold. Island-wide covariates, such as satellite vegetation indices or land-cover maps, housing type and building density, would allow kriging with external drift, so that the green-space association could inform predictions in the unsampled north, west and east. A denser design of about 100 to 150 sites</w:t>
-      </w:r>
-      <w:r>
-        <w:t xml:space="preserve"> </w:t>
-      </w:r>
-      <w:r>
-        <w:t xml:space="preserve">(Webster and Oliver 1992)</w:t>
-      </w:r>
-      <w:r>
-        <w:t xml:space="preserve">, including pairs less than 1 km apart and sites in the unsampled regions, would stabilize the variogram and remove most of the extrapolation.</w:t>
+        <w:t xml:space="preserve">; population denominators address a different quantity, cases per person. Island-wide covariates, such as satellite vegetation indices or land-cover maps, housing type and building density, would allow kriging with external drift, so that the green-space association could inform predictions in the unsampled north, west and east. A larger, more evenly distributed design, including pairs less than 1 km apart and sites in unsampled regions, could improve variogram estimation and reduce extrapolation. The 100 to 150 observations discussed by</w:t>
+      </w:r>
+      <w:r>
+        <w:t xml:space="preserve"> </w:t>
+      </w:r>
+      <w:r>
+        <w:t xml:space="preserve">Webster and Oliver (1992)</w:t>
+      </w:r>
+      <w:r>
+        <w:t xml:space="preserve"> </w:t>
+      </w:r>
+      <w:r>
+        <w:t xml:space="preserve">provide context from soil-survey simulations, not a guarantee of stability for this setting.</w:t>
       </w:r>
     </w:p>
     <w:p>
@@ -14131,7 +14423,7 @@
         <w:pStyle w:val="FirstParagraph"/>
       </w:pPr>
       <w:r>
-        <w:t xml:space="preserve">With 30 sites, spatial correlation could be estimated only under carefully chosen settings, and most automated fits failed. A spherical variogram with 3 km bins converged and improved cross-validated prediction over a no-correlation model, with standardized error SD near one. Kriging identified one high-risk zone from Marina Bay to Hougang, consistent across alternative variograms, with about twice the predicted intensity of the rest of the sampled area. Green cover is lowest in this zone, and positive spatial autocorrelation was weaker after accounting for green space, consistent with green space capturing part of the geographic pattern. The ecological association cannot be read causally. Braddell Heights and Kampong Glam Community Clubs are accessible, well-placed venues for temporary intervention centers. Uncertainty in the variogram, the unknown support of the counts and the large unsampled area limit the operational use of the map.</w:t>
+        <w:t xml:space="preserve">With 30 sites, only five of the 180 tested settings met the specified variogram stability criteria. A spherical variogram with 3 km bins converged and had lower fixed-variogram leave-one-out RMSE than a no-correlation model, with standardized error SD near one; independent predictive accuracy remains unestablished. Kriging identified one high-risk zone from Marina Bay to Hougang, consistent across the tested alternative ordinary-kriging variograms, with about twice the predicted intensity of the rest of the sampled area. This zone includes the sites with the lowest green cover, and positive spatial autocorrelation was weaker after accounting for green space, consistent with green space capturing part of the geographic pattern. The ecological association cannot be read causally. Braddell Heights and Kampong Glam Community Clubs met the specified proximity criteria and minimized the modeled distance objective among the shortlisted pairs; operational suitability remains unverified. Uncertainty in the variogram, the unknown support of the counts and the large unsampled area limit the operational use of the map.</w:t>
       </w:r>
     </w:p>
     <w:bookmarkEnd w:id="122"/>
@@ -14154,7 +14446,7 @@
       </w:r>
     </w:p>
     <w:bookmarkEnd w:id="124"/>
-    <w:bookmarkStart w:id="193" w:name="references"/>
+    <w:bookmarkStart w:id="197" w:name="references"/>
     <w:p>
       <w:pPr>
         <w:pStyle w:val="Heading1"/>
@@ -14163,7 +14455,7 @@
         <w:t xml:space="preserve">References</w:t>
       </w:r>
     </w:p>
-    <w:bookmarkStart w:id="192" w:name="refs"/>
+    <w:bookmarkStart w:id="196" w:name="refs"/>
     <w:bookmarkStart w:id="126" w:name="ref-anselin1996"/>
     <w:p>
       <w:pPr>
@@ -15107,19 +15399,19 @@
       </w:r>
     </w:p>
     <w:bookmarkEnd w:id="161"/>
-    <w:bookmarkStart w:id="163" w:name="ref-moran1950"/>
+    <w:bookmarkStart w:id="163" w:name="ref-mila2022"/>
     <w:p>
       <w:pPr>
         <w:pStyle w:val="Bibliography"/>
       </w:pPr>
       <w:r>
-        <w:t xml:space="preserve">Moran, P. A. P. 1950.</w:t>
-      </w:r>
-      <w:r>
-        <w:t xml:space="preserve"> </w:t>
-      </w:r>
-      <w:r>
-        <w:t xml:space="preserve">“Notes on Continuous Stochastic Phenomena.”</w:t>
+        <w:t xml:space="preserve">Milà, Carles, Jorge Mateu, Edzer Pebesma, and Hanna Meyer. 2022.</w:t>
+      </w:r>
+      <w:r>
+        <w:t xml:space="preserve"> </w:t>
+      </w:r>
+      <w:r>
+        <w:t xml:space="preserve">“Nearest Neighbour Distance Matching Leave-One-Out Cross-Validation for Map Validation.”</w:t>
       </w:r>
       <w:r>
         <w:t xml:space="preserve"> </w:t>
@@ -15129,6 +15421,52 @@
           <w:i/>
           <w:iCs/>
         </w:rPr>
+        <w:t xml:space="preserve">Methods in Ecology and Evolution</w:t>
+      </w:r>
+      <w:r>
+        <w:t xml:space="preserve"> </w:t>
+      </w:r>
+      <w:r>
+        <w:t xml:space="preserve">13 (6): 1304-16.</w:t>
+      </w:r>
+      <w:r>
+        <w:t xml:space="preserve"> </w:t>
+      </w:r>
+      <w:hyperlink r:id="rId162">
+        <w:r>
+          <w:rPr>
+            <w:rStyle w:val="Hyperlink"/>
+          </w:rPr>
+          <w:t xml:space="preserve">https://doi.org/10.1111/2041-210X.13851</w:t>
+        </w:r>
+      </w:hyperlink>
+      <w:r>
+        <w:t xml:space="preserve">.</w:t>
+      </w:r>
+    </w:p>
+    <w:bookmarkEnd w:id="163"/>
+    <w:bookmarkStart w:id="165" w:name="ref-moran1950"/>
+    <w:p>
+      <w:pPr>
+        <w:pStyle w:val="Bibliography"/>
+      </w:pPr>
+      <w:r>
+        <w:t xml:space="preserve">Moran, P. A. P. 1950.</w:t>
+      </w:r>
+      <w:r>
+        <w:t xml:space="preserve"> </w:t>
+      </w:r>
+      <w:r>
+        <w:t xml:space="preserve">“Notes on Continuous Stochastic Phenomena.”</w:t>
+      </w:r>
+      <w:r>
+        <w:t xml:space="preserve"> </w:t>
+      </w:r>
+      <w:r>
+        <w:rPr>
+          <w:i/>
+          <w:iCs/>
+        </w:rPr>
         <w:t xml:space="preserve">Biometrika</w:t>
       </w:r>
       <w:r>
@@ -15140,7 +15478,7 @@
       <w:r>
         <w:t xml:space="preserve"> </w:t>
       </w:r>
-      <w:hyperlink r:id="rId162">
+      <w:hyperlink r:id="rId164">
         <w:r>
           <w:rPr>
             <w:rStyle w:val="Hyperlink"/>
@@ -15152,8 +15490,8 @@
         <w:t xml:space="preserve">.</w:t>
       </w:r>
     </w:p>
-    <w:bookmarkEnd w:id="163"/>
-    <w:bookmarkStart w:id="165" w:name="ref-morgenstern1995"/>
+    <w:bookmarkEnd w:id="165"/>
+    <w:bookmarkStart w:id="167" w:name="ref-morgenstern1995"/>
     <w:p>
       <w:pPr>
         <w:pStyle w:val="Bibliography"/>
@@ -15186,7 +15524,7 @@
       <w:r>
         <w:t xml:space="preserve"> </w:t>
       </w:r>
-      <w:hyperlink r:id="rId164">
+      <w:hyperlink r:id="rId166">
         <w:r>
           <w:rPr>
             <w:rStyle w:val="Hyperlink"/>
@@ -15198,8 +15536,8 @@
         <w:t xml:space="preserve">.</w:t>
       </w:r>
     </w:p>
-    <w:bookmarkEnd w:id="165"/>
-    <w:bookmarkStart w:id="167" w:name="ref-oliver2014"/>
+    <w:bookmarkEnd w:id="167"/>
+    <w:bookmarkStart w:id="169" w:name="ref-oliver2014"/>
     <w:p>
       <w:pPr>
         <w:pStyle w:val="Bibliography"/>
@@ -15232,7 +15570,7 @@
       <w:r>
         <w:t xml:space="preserve"> </w:t>
       </w:r>
-      <w:hyperlink r:id="rId166">
+      <w:hyperlink r:id="rId168">
         <w:r>
           <w:rPr>
             <w:rStyle w:val="Hyperlink"/>
@@ -15244,8 +15582,8 @@
         <w:t xml:space="preserve">.</w:t>
       </w:r>
     </w:p>
-    <w:bookmarkEnd w:id="167"/>
-    <w:bookmarkStart w:id="169" w:name="ref-ooi2006"/>
+    <w:bookmarkEnd w:id="169"/>
+    <w:bookmarkStart w:id="171" w:name="ref-ooi2006"/>
     <w:p>
       <w:pPr>
         <w:pStyle w:val="Bibliography"/>
@@ -15287,7 +15625,7 @@
       <w:r>
         <w:t xml:space="preserve"> </w:t>
       </w:r>
-      <w:hyperlink r:id="rId168">
+      <w:hyperlink r:id="rId170">
         <w:r>
           <w:rPr>
             <w:rStyle w:val="Hyperlink"/>
@@ -15299,8 +15637,8 @@
         <w:t xml:space="preserve">.</w:t>
       </w:r>
     </w:p>
-    <w:bookmarkEnd w:id="169"/>
-    <w:bookmarkStart w:id="171" w:name="ref-paupy2009"/>
+    <w:bookmarkEnd w:id="171"/>
+    <w:bookmarkStart w:id="173" w:name="ref-paupy2009"/>
     <w:p>
       <w:pPr>
         <w:pStyle w:val="Bibliography"/>
@@ -15343,7 +15681,7 @@
       <w:r>
         <w:t xml:space="preserve"> </w:t>
       </w:r>
-      <w:hyperlink r:id="rId170">
+      <w:hyperlink r:id="rId172">
         <w:r>
           <w:rPr>
             <w:rStyle w:val="Hyperlink"/>
@@ -15355,8 +15693,8 @@
         <w:t xml:space="preserve">.</w:t>
       </w:r>
     </w:p>
-    <w:bookmarkEnd w:id="171"/>
-    <w:bookmarkStart w:id="173" w:name="ref-pebesma2004"/>
+    <w:bookmarkEnd w:id="173"/>
+    <w:bookmarkStart w:id="175" w:name="ref-pebesma2004"/>
     <w:p>
       <w:pPr>
         <w:pStyle w:val="Bibliography"/>
@@ -15410,7 +15748,7 @@
       <w:r>
         <w:t xml:space="preserve"> </w:t>
       </w:r>
-      <w:hyperlink r:id="rId172">
+      <w:hyperlink r:id="rId174">
         <w:r>
           <w:rPr>
             <w:rStyle w:val="Hyperlink"/>
@@ -15422,8 +15760,8 @@
         <w:t xml:space="preserve">.</w:t>
       </w:r>
     </w:p>
-    <w:bookmarkEnd w:id="173"/>
-    <w:bookmarkStart w:id="175" w:name="ref-pebesma2018"/>
+    <w:bookmarkEnd w:id="175"/>
+    <w:bookmarkStart w:id="177" w:name="ref-pebesma2018"/>
     <w:p>
       <w:pPr>
         <w:pStyle w:val="Bibliography"/>
@@ -15465,7 +15803,7 @@
       <w:r>
         <w:t xml:space="preserve"> </w:t>
       </w:r>
-      <w:hyperlink r:id="rId174">
+      <w:hyperlink r:id="rId176">
         <w:r>
           <w:rPr>
             <w:rStyle w:val="Hyperlink"/>
@@ -15477,8 +15815,8 @@
         <w:t xml:space="preserve">.</w:t>
       </w:r>
     </w:p>
-    <w:bookmarkEnd w:id="175"/>
-    <w:bookmarkStart w:id="177" w:name="ref-gstatmanual"/>
+    <w:bookmarkEnd w:id="177"/>
+    <w:bookmarkStart w:id="179" w:name="ref-gstatmanual"/>
     <w:p>
       <w:pPr>
         <w:pStyle w:val="Bibliography"/>
@@ -15509,7 +15847,7 @@
       <w:r>
         <w:t xml:space="preserve"> </w:t>
       </w:r>
-      <w:hyperlink r:id="rId176">
+      <w:hyperlink r:id="rId178">
         <w:r>
           <w:rPr>
             <w:rStyle w:val="Hyperlink"/>
@@ -15521,8 +15859,8 @@
         <w:t xml:space="preserve">.</w:t>
       </w:r>
     </w:p>
-    <w:bookmarkEnd w:id="177"/>
-    <w:bookmarkStart w:id="179" w:name="ref-pa2024"/>
+    <w:bookmarkEnd w:id="179"/>
+    <w:bookmarkStart w:id="181" w:name="ref-pa2024"/>
     <w:p>
       <w:pPr>
         <w:pStyle w:val="Bibliography"/>
@@ -15546,7 +15884,7 @@
       <w:r>
         <w:t xml:space="preserve"> </w:t>
       </w:r>
-      <w:hyperlink r:id="rId178">
+      <w:hyperlink r:id="rId180">
         <w:r>
           <w:rPr>
             <w:rStyle w:val="Hyperlink"/>
@@ -15558,8 +15896,8 @@
         <w:t xml:space="preserve">.</w:t>
       </w:r>
     </w:p>
-    <w:bookmarkEnd w:id="179"/>
-    <w:bookmarkStart w:id="181" w:name="ref-onepa2026"/>
+    <w:bookmarkEnd w:id="181"/>
+    <w:bookmarkStart w:id="183" w:name="ref-onepa2026"/>
     <w:p>
       <w:pPr>
         <w:pStyle w:val="Bibliography"/>
@@ -15597,7 +15935,7 @@
       <w:r>
         <w:t xml:space="preserve"> </w:t>
       </w:r>
-      <w:hyperlink r:id="rId180">
+      <w:hyperlink r:id="rId182">
         <w:r>
           <w:rPr>
             <w:rStyle w:val="Hyperlink"/>
@@ -15609,8 +15947,8 @@
         <w:t xml:space="preserve">.</w:t>
       </w:r>
     </w:p>
-    <w:bookmarkEnd w:id="181"/>
-    <w:bookmarkStart w:id="183" w:name="ref-seidahmed2018"/>
+    <w:bookmarkEnd w:id="183"/>
+    <w:bookmarkStart w:id="185" w:name="ref-seidahmed2018"/>
     <w:p>
       <w:pPr>
         <w:pStyle w:val="Bibliography"/>
@@ -15655,7 +15993,7 @@
       <w:r>
         <w:t xml:space="preserve"> </w:t>
       </w:r>
-      <w:hyperlink r:id="rId182">
+      <w:hyperlink r:id="rId184">
         <w:r>
           <w:rPr>
             <w:rStyle w:val="Hyperlink"/>
@@ -15667,8 +16005,8 @@
         <w:t xml:space="preserve">.</w:t>
       </w:r>
     </w:p>
-    <w:bookmarkEnd w:id="183"/>
-    <w:bookmarkStart w:id="185" w:name="ref-twohig2018"/>
+    <w:bookmarkEnd w:id="185"/>
+    <w:bookmarkStart w:id="187" w:name="ref-twohig2018"/>
     <w:p>
       <w:pPr>
         <w:pStyle w:val="Bibliography"/>
@@ -15701,7 +16039,7 @@
       <w:r>
         <w:t xml:space="preserve"> </w:t>
       </w:r>
-      <w:hyperlink r:id="rId184">
+      <w:hyperlink r:id="rId186">
         <w:r>
           <w:rPr>
             <w:rStyle w:val="Hyperlink"/>
@@ -15713,8 +16051,8 @@
         <w:t xml:space="preserve">.</w:t>
       </w:r>
     </w:p>
-    <w:bookmarkEnd w:id="185"/>
-    <w:bookmarkStart w:id="187" w:name="ref-ura2019"/>
+    <w:bookmarkEnd w:id="187"/>
+    <w:bookmarkStart w:id="189" w:name="ref-ura2019"/>
     <w:p>
       <w:pPr>
         <w:pStyle w:val="Bibliography"/>
@@ -15738,7 +16076,7 @@
       <w:r>
         <w:t xml:space="preserve"> </w:t>
       </w:r>
-      <w:hyperlink r:id="rId186">
+      <w:hyperlink r:id="rId188">
         <w:r>
           <w:rPr>
             <w:rStyle w:val="Hyperlink"/>
@@ -15750,8 +16088,8 @@
         <w:t xml:space="preserve">.</w:t>
       </w:r>
     </w:p>
-    <w:bookmarkEnd w:id="187"/>
-    <w:bookmarkStart w:id="189" w:name="ref-waller2004"/>
+    <w:bookmarkEnd w:id="189"/>
+    <w:bookmarkStart w:id="191" w:name="ref-waller2004"/>
     <w:p>
       <w:pPr>
         <w:pStyle w:val="Bibliography"/>
@@ -15775,7 +16113,7 @@
       <w:r>
         <w:t xml:space="preserve"> </w:t>
       </w:r>
-      <w:hyperlink r:id="rId188">
+      <w:hyperlink r:id="rId190">
         <w:r>
           <w:rPr>
             <w:rStyle w:val="Hyperlink"/>
@@ -15787,8 +16125,8 @@
         <w:t xml:space="preserve">.</w:t>
       </w:r>
     </w:p>
-    <w:bookmarkEnd w:id="189"/>
-    <w:bookmarkStart w:id="191" w:name="ref-webster1992"/>
+    <w:bookmarkEnd w:id="191"/>
+    <w:bookmarkStart w:id="193" w:name="ref-webster1992"/>
     <w:p>
       <w:pPr>
         <w:pStyle w:val="Bibliography"/>
@@ -15821,7 +16159,7 @@
       <w:r>
         <w:t xml:space="preserve"> </w:t>
       </w:r>
-      <w:hyperlink r:id="rId190">
+      <w:hyperlink r:id="rId192">
         <w:r>
           <w:rPr>
             <w:rStyle w:val="Hyperlink"/>
@@ -15833,10 +16171,56 @@
         <w:t xml:space="preserve">.</w:t>
       </w:r>
     </w:p>
-    <w:bookmarkEnd w:id="191"/>
-    <w:bookmarkEnd w:id="192"/>
     <w:bookmarkEnd w:id="193"/>
-    <w:bookmarkStart w:id="196" w:name="appendix-a-reproducibility"/>
+    <w:bookmarkStart w:id="195" w:name="ref-zimmerman1992"/>
+    <w:p>
+      <w:pPr>
+        <w:pStyle w:val="Bibliography"/>
+      </w:pPr>
+      <w:r>
+        <w:t xml:space="preserve">Zimmerman, Dale L., and Noel Cressie. 1992.</w:t>
+      </w:r>
+      <w:r>
+        <w:t xml:space="preserve"> </w:t>
+      </w:r>
+      <w:r>
+        <w:t xml:space="preserve">“Mean Squared Prediction Error in the Spatial Linear Model with Estimated Covariance Parameters.”</w:t>
+      </w:r>
+      <w:r>
+        <w:t xml:space="preserve"> </w:t>
+      </w:r>
+      <w:r>
+        <w:rPr>
+          <w:i/>
+          <w:iCs/>
+        </w:rPr>
+        <w:t xml:space="preserve">Annals of the Institute of Statistical Mathematics</w:t>
+      </w:r>
+      <w:r>
+        <w:t xml:space="preserve"> </w:t>
+      </w:r>
+      <w:r>
+        <w:t xml:space="preserve">44 (1): 27-43.</w:t>
+      </w:r>
+      <w:r>
+        <w:t xml:space="preserve"> </w:t>
+      </w:r>
+      <w:hyperlink r:id="rId194">
+        <w:r>
+          <w:rPr>
+            <w:rStyle w:val="Hyperlink"/>
+          </w:rPr>
+          <w:t xml:space="preserve">https://doi.org/10.1007/BF00048668</w:t>
+        </w:r>
+      </w:hyperlink>
+      <w:r>
+        <w:t xml:space="preserve">.</w:t>
+      </w:r>
+    </w:p>
+    <w:bookmarkEnd w:id="195"/>
+    <w:bookmarkEnd w:id="196"/>
+    <w:bookmarkEnd w:id="197"/>
+    <w:bookmarkStart w:id="200" w:name="appendix-a-reproducibility"/>
     <w:p>
       <w:pPr>
         <w:pStyle w:val="Heading1"/>
@@ -15855,7 +16239,7 @@
       <w:r>
         <w:t xml:space="preserve"> </w:t>
       </w:r>
-      <w:hyperlink r:id="rId194">
+      <w:hyperlink r:id="rId198">
         <w:r>
           <w:rPr>
             <w:rStyle w:val="Hyperlink"/>
@@ -15998,7 +16382,7 @@
       <w:tr>
         <w:tc>
           <w:tcPr/>
-          <w:bookmarkStart w:id="195" w:name="tbl-stable"/>
+          <w:bookmarkStart w:id="199" w:name="tbl-stable"/>
           <w:p>
             <w:pPr>
               <w:jc w:val="center"/>
@@ -16748,13 +17132,13 @@
               </w:tc>
             </w:tr>
           </w:tbl>
-          <w:bookmarkEnd w:id="195"/>
+          <w:bookmarkEnd w:id="199"/>
           <w:p/>
         </w:tc>
       </w:tr>
     </w:tbl>
-    <w:bookmarkEnd w:id="196"/>
-    <w:bookmarkStart w:id="197" w:name="appendix-b-r-code"/>
+    <w:bookmarkEnd w:id="200"/>
+    <w:bookmarkStart w:id="201" w:name="appendix-b-r-code"/>
     <w:p>
       <w:pPr>
         <w:pStyle w:val="Heading1"/>
@@ -17910,7 +18294,7 @@
         <w:t xml:space="preserve">.</w:t>
       </w:r>
     </w:p>
-    <w:bookmarkEnd w:id="197"/>
+    <w:bookmarkEnd w:id="201"/>
     <w:sectPr>
       <w:footnotePr>
         <w:numRestart w:val="eachSect"/>

</xml_diff>